<commit_message>
update docs for troubleshoot
</commit_message>
<xml_diff>
--- a/q4-troubleshooting/essay.docx
+++ b/q4-troubleshooting/essay.docx
@@ -340,12 +340,19 @@
         <w:pStyle w:val="FirstParagraph"/>
       </w:pPr>
       <w:r>
-        <w:t xml:space="preserve">Two complementary approaches, used together:</w:t>
-      </w:r>
-    </w:p>
-    <w:p>
-      <w:pPr>
-        <w:pStyle w:val="Compact"/>
+        <w:t xml:space="preserve">Think of troubleshooting like finding where a letter got lost in the mail. You don’t search everywhere at once; you trace the route the letter took and check each step.</w:t>
+      </w:r>
+    </w:p>
+    <w:p>
+      <w:pPr>
+        <w:pStyle w:val="BodyText"/>
+      </w:pPr>
+      <w:r>
+        <w:t xml:space="preserve">We use two complementary approaches together:</w:t>
+      </w:r>
+    </w:p>
+    <w:p>
+      <w:pPr>
         <w:numPr>
           <w:ilvl w:val="0"/>
           <w:numId w:val="1003"/>
@@ -362,7 +369,7 @@
         <w:t xml:space="preserve"> </w:t>
       </w:r>
       <w:r>
-        <w:t xml:space="preserve">from source (cloud app) to destination (on-prem DB). At each hop, ask:</w:t>
+        <w:t xml:space="preserve">— imagine following a data packet from the cloud app to the on-prem database. At each stop along the way, ask:</w:t>
       </w:r>
       <w:r>
         <w:t xml:space="preserve"> </w:t>
@@ -374,10 +381,15 @@
         </w:rPr>
         <w:t xml:space="preserve">can the packet still get through here?</w:t>
       </w:r>
-    </w:p>
-    <w:p>
-      <w:pPr>
-        <w:pStyle w:val="Compact"/>
+      <w:r>
+        <w:t xml:space="preserve"> </w:t>
+      </w:r>
+      <w:r>
+        <w:t xml:space="preserve">This tells us which section of the path is broken.</w:t>
+      </w:r>
+    </w:p>
+    <w:p>
+      <w:pPr>
         <w:numPr>
           <w:ilvl w:val="0"/>
           <w:numId w:val="1003"/>
@@ -394,7 +406,7 @@
         <w:t xml:space="preserve"> </w:t>
       </w:r>
       <w:r>
-        <w:t xml:space="preserve">within each hop: physical → data link → network → transport → application. If a low layer is broken, every higher layer fails — so don’t waste time debugging TLS while the tunnel is down.</w:t>
+        <w:t xml:space="preserve">— once we’ve identified a broken section, we check it from the lowest layer (physical cables) up to the highest layer (applications). This matters because if the cables are disconnected, there’s no point checking the application settings. Start with the basics first.</w:t>
       </w:r>
     </w:p>
     <w:p>
@@ -402,7 +414,7 @@
         <w:pStyle w:val="FirstParagraph"/>
       </w:pPr>
       <w:r>
-        <w:t xml:space="preserve">This combined approach is what the course’s troubleshooting cheat sheet teaches, applied to a hybrid AWS scenario.</w:t>
+        <w:t xml:space="preserve">This is the method taught in the course, and it works well for hybrid AWS scenarios where you have both cloud and on-premises systems talking to each other.</w:t>
       </w:r>
     </w:p>
     <w:bookmarkStart w:id="14" w:name="the-five-hops-along-the-path"/>
@@ -423,37 +435,31 @@
           <w:b/>
           <w:bCs/>
         </w:rPr>
-        <w:t xml:space="preserve">Hop 1: Cloud app (EC2 / Lambda).</w:t>
-      </w:r>
-      <w:r>
-        <w:t xml:space="preserve"> </w:t>
-      </w:r>
-      <w:r>
-        <w:t xml:space="preserve">Check that the app is connecting to the right hostname, right port, right credentials, and with a sensible timeout. How: read the connection string in the app code or config; check application logs (is the error</w:t>
-      </w:r>
-      <w:r>
-        <w:t xml:space="preserve"> </w:t>
-      </w:r>
-      <w:r>
-        <w:t xml:space="preserve">“timeout”</w:t>
-      </w:r>
-      <w:r>
-        <w:t xml:space="preserve"> </w:t>
-      </w:r>
-      <w:r>
-        <w:t xml:space="preserve">— a network problem — or</w:t>
-      </w:r>
-      <w:r>
-        <w:t xml:space="preserve"> </w:t>
-      </w:r>
-      <w:r>
-        <w:t xml:space="preserve">“auth refused”</w:t>
-      </w:r>
-      <w:r>
-        <w:t xml:space="preserve"> </w:t>
-      </w:r>
-      <w:r>
-        <w:t xml:space="preserve">— a credential problem?).</w:t>
+        <w:t xml:space="preserve">Hop 1: Cloud app (EC2 or Lambda server).</w:t>
+      </w:r>
+      <w:r>
+        <w:t xml:space="preserve"> </w:t>
+      </w:r>
+      <w:r>
+        <w:t xml:space="preserve">The application needs to know: what’s the database hostname? What port? What username and password? Check the connection string in the app’s code or config file. When there’s an error, the logs will tell you if it’s a network problem (</w:t>
+      </w:r>
+      <w:r>
+        <w:t xml:space="preserve">“connection timeout”</w:t>
+      </w:r>
+      <w:r>
+        <w:t xml:space="preserve"> </w:t>
+      </w:r>
+      <w:r>
+        <w:t xml:space="preserve">= network is slow or down) or a credential problem (</w:t>
+      </w:r>
+      <w:r>
+        <w:t xml:space="preserve">“auth failed”</w:t>
+      </w:r>
+      <w:r>
+        <w:t xml:space="preserve"> </w:t>
+      </w:r>
+      <w:r>
+        <w:t xml:space="preserve">= wrong password or username).</w:t>
       </w:r>
     </w:p>
     <w:p>
@@ -465,13 +471,31 @@
           <w:b/>
           <w:bCs/>
         </w:rPr>
-        <w:t xml:space="preserve">Hop 2: Cloud network (VPC subnet + Security Group + Route Table).</w:t>
-      </w:r>
-      <w:r>
-        <w:t xml:space="preserve"> </w:t>
-      </w:r>
-      <w:r>
-        <w:t xml:space="preserve">Check that the app is in a VPC subnet (not public internet–bound), the Security Group allows outbound traffic to the on-prem CIDR on the DB port, and the route table is configured to send on-prem CIDR traffic via the Virtual Private Gateway (VGW). How: VPC console to verify the app’s ENI is in the right subnet, SG rules;</w:t>
+        <w:t xml:space="preserve">Hop 2: Cloud network (VPC security and routing).</w:t>
+      </w:r>
+      <w:r>
+        <w:t xml:space="preserve"> </w:t>
+      </w:r>
+      <w:r>
+        <w:t xml:space="preserve">AWS has three layers of security and routing: the subnet (which network segment is the app in?), the Security Group (like a firewall that says</w:t>
+      </w:r>
+      <w:r>
+        <w:t xml:space="preserve"> </w:t>
+      </w:r>
+      <w:r>
+        <w:t xml:space="preserve">“traffic to port 5432 is allowed out”</w:t>
+      </w:r>
+      <w:r>
+        <w:t xml:space="preserve">), and the Route Table (tells packets</w:t>
+      </w:r>
+      <w:r>
+        <w:t xml:space="preserve"> </w:t>
+      </w:r>
+      <w:r>
+        <w:t xml:space="preserve">“to reach the on-prem database, send it through the VPN tunnel”</w:t>
+      </w:r>
+      <w:r>
+        <w:t xml:space="preserve">). Check that all three are correctly configured. AWS tools: use the VPC console to see the settings; use</w:t>
       </w:r>
       <w:r>
         <w:t xml:space="preserve"> </w:t>
@@ -487,23 +511,7 @@
         <w:t xml:space="preserve"> </w:t>
       </w:r>
       <w:r>
-        <w:t xml:space="preserve">to test subnet-to-destination;</w:t>
-      </w:r>
-      <w:r>
-        <w:t xml:space="preserve"> </w:t>
-      </w:r>
-      <w:r>
-        <w:rPr>
-          <w:b/>
-          <w:bCs/>
-        </w:rPr>
-        <w:t xml:space="preserve">VPC Flow Logs</w:t>
-      </w:r>
-      <w:r>
-        <w:t xml:space="preserve"> </w:t>
-      </w:r>
-      <w:r>
-        <w:t xml:space="preserve">to check for REJECT packets.</w:t>
+        <w:t xml:space="preserve">to test if packets can travel from the app to the database.</w:t>
       </w:r>
     </w:p>
     <w:p>
@@ -515,13 +523,25 @@
           <w:b/>
           <w:bCs/>
         </w:rPr>
-        <w:t xml:space="preserve">Hop 3: VPN tunnel (AWS VGW ↔ on-prem firewall, IPsec).</w:t>
-      </w:r>
-      <w:r>
-        <w:t xml:space="preserve"> </w:t>
-      </w:r>
-      <w:r>
-        <w:t xml:space="preserve">Check that the tunnel state is UP on both sides, IKE phase 1 + IPsec phase 2 are negotiated, the pre-shared key matches, and both sides have routes for the other’s subnets. How:</w:t>
+        <w:t xml:space="preserve">Hop 3: VPN tunnel (the encrypted connection between cloud and on-premises).</w:t>
+      </w:r>
+      <w:r>
+        <w:t xml:space="preserve"> </w:t>
+      </w:r>
+      <w:r>
+        <w:t xml:space="preserve">The tunnel is like a secure phone line between AWS and your office. Both sides need to agree on how to encrypt/decrypt the call, and both sides need to have the same secret key. Check that the tunnel shows as</w:t>
+      </w:r>
+      <w:r>
+        <w:t xml:space="preserve"> </w:t>
+      </w:r>
+      <w:r>
+        <w:t xml:space="preserve">“UP”</w:t>
+      </w:r>
+      <w:r>
+        <w:t xml:space="preserve"> </w:t>
+      </w:r>
+      <w:r>
+        <w:t xml:space="preserve">on both sides, and that the secret key and encryption settings match. AWS tools:</w:t>
       </w:r>
       <w:r>
         <w:t xml:space="preserve"> </w:t>
@@ -536,7 +556,7 @@
         <w:t xml:space="preserve"> </w:t>
       </w:r>
       <w:r>
-        <w:t xml:space="preserve">to poll AWS tunnel state; CloudWatch metric</w:t>
+        <w:t xml:space="preserve">to check the tunnel status; on your office equipment, there’s usually a command like</w:t>
       </w:r>
       <w:r>
         <w:t xml:space="preserve"> </w:t>
@@ -545,13 +565,61 @@
         <w:rPr>
           <w:rStyle w:val="VerbatimChar"/>
         </w:rPr>
-        <w:t xml:space="preserve">TunnelState</w:t>
-      </w:r>
-      <w:r>
-        <w:t xml:space="preserve"> </w:t>
-      </w:r>
-      <w:r>
-        <w:t xml:space="preserve">should be 1 (UP); on-prem router/firewall console</w:t>
+        <w:t xml:space="preserve">show crypto</w:t>
+      </w:r>
+      <w:r>
+        <w:t xml:space="preserve"> </w:t>
+      </w:r>
+      <w:r>
+        <w:t xml:space="preserve">to verify the tunnel is established.</w:t>
+      </w:r>
+    </w:p>
+    <w:p>
+      <w:pPr>
+        <w:pStyle w:val="BodyText"/>
+      </w:pPr>
+      <w:r>
+        <w:rPr>
+          <w:b/>
+          <w:bCs/>
+        </w:rPr>
+        <w:t xml:space="preserve">Hop 4: On-prem network (your office firewall, switches, and routing).</w:t>
+      </w:r>
+      <w:r>
+        <w:t xml:space="preserve"> </w:t>
+      </w:r>
+      <w:r>
+        <w:t xml:space="preserve">Your office firewall is like a bouncer at a club — it decides which traffic is allowed in and which is blocked. Make sure the firewall allows traffic from the cloud (on port 5432 for the database). Also make sure your office network knows how to route data back to AWS (no</w:t>
+      </w:r>
+      <w:r>
+        <w:t xml:space="preserve"> </w:t>
+      </w:r>
+      <w:r>
+        <w:t xml:space="preserve">“return path mystery”</w:t>
+      </w:r>
+      <w:r>
+        <w:t xml:space="preserve"> </w:t>
+      </w:r>
+      <w:r>
+        <w:t xml:space="preserve">where the response goes somewhere else). Tools: check the firewall rules in your office IT console; check the office router’s routing table; verify that the database server is on the right network segment.</w:t>
+      </w:r>
+    </w:p>
+    <w:p>
+      <w:pPr>
+        <w:pStyle w:val="BodyText"/>
+      </w:pPr>
+      <w:r>
+        <w:rPr>
+          <w:b/>
+          <w:bCs/>
+        </w:rPr>
+        <w:t xml:space="preserve">Hop 5: Database server itself.</w:t>
+      </w:r>
+      <w:r>
+        <w:t xml:space="preserve"> </w:t>
+      </w:r>
+      <w:r>
+        <w:t xml:space="preserve">The database server must be listening for connections on port 5432 (for PostgreSQL) or 3306 (for MySQL). The database also has its own access control — it needs to allow connections from the cloud app’s IP address, and the username/password must be correct. Tools: log in to the database server and run</w:t>
       </w:r>
       <w:r>
         <w:t xml:space="preserve"> </w:t>
@@ -560,49 +628,13 @@
         <w:rPr>
           <w:rStyle w:val="VerbatimChar"/>
         </w:rPr>
-        <w:t xml:space="preserve">show crypto isakmp sa</w:t>
-      </w:r>
-      <w:r>
-        <w:t xml:space="preserve"> </w:t>
-      </w:r>
-      <w:r>
-        <w:t xml:space="preserve">(Cisco) to verify both phases are established.</w:t>
-      </w:r>
-    </w:p>
-    <w:p>
-      <w:pPr>
-        <w:pStyle w:val="BodyText"/>
-      </w:pPr>
-      <w:r>
-        <w:rPr>
-          <w:b/>
-          <w:bCs/>
-        </w:rPr>
-        <w:t xml:space="preserve">Hop 4: On-prem network (firewall + switch / VLAN + return route).</w:t>
-      </w:r>
-      <w:r>
-        <w:t xml:space="preserve"> </w:t>
-      </w:r>
-      <w:r>
-        <w:t xml:space="preserve">Check that the on-prem firewall allows inbound from the VPC CIDR on the DB port, a return route to AWS exists (no asymmetric routing), and the DB server is in the right VLAN with the port up. How: firewall console ACL rules; on-prem routing table to verify return route to AWS CIDR exists; switch CAM table to verify DB server MAC is learnt on the right VLAN port.</w:t>
-      </w:r>
-    </w:p>
-    <w:p>
-      <w:pPr>
-        <w:pStyle w:val="BodyText"/>
-      </w:pPr>
-      <w:r>
-        <w:rPr>
-          <w:b/>
-          <w:bCs/>
-        </w:rPr>
-        <w:t xml:space="preserve">Hop 5: DB server.</w:t>
-      </w:r>
-      <w:r>
-        <w:t xml:space="preserve"> </w:t>
-      </w:r>
-      <w:r>
-        <w:t xml:space="preserve">Check that the listener is running on the right port,</w:t>
+        <w:t xml:space="preserve">netstat -lntp</w:t>
+      </w:r>
+      <w:r>
+        <w:t xml:space="preserve"> </w:t>
+      </w:r>
+      <w:r>
+        <w:t xml:space="preserve">to see what ports are listening; check the database logs; try connecting from the cloud using a test command like</w:t>
       </w:r>
       <w:r>
         <w:t xml:space="preserve"> </w:t>
@@ -611,13 +643,13 @@
         <w:rPr>
           <w:rStyle w:val="VerbatimChar"/>
         </w:rPr>
-        <w:t xml:space="preserve">pg_hba.conf</w:t>
-      </w:r>
-      <w:r>
-        <w:t xml:space="preserve"> </w:t>
-      </w:r>
-      <w:r>
-        <w:t xml:space="preserve">(PostgreSQL) /</w:t>
+        <w:t xml:space="preserve">psql</w:t>
+      </w:r>
+      <w:r>
+        <w:t xml:space="preserve"> </w:t>
+      </w:r>
+      <w:r>
+        <w:t xml:space="preserve">or</w:t>
       </w:r>
       <w:r>
         <w:t xml:space="preserve"> </w:t>
@@ -626,73 +658,13 @@
         <w:rPr>
           <w:rStyle w:val="VerbatimChar"/>
         </w:rPr>
-        <w:t xml:space="preserve">GRANT</w:t>
-      </w:r>
-      <w:r>
-        <w:t xml:space="preserve"> </w:t>
-      </w:r>
-      <w:r>
-        <w:t xml:space="preserve">(MySQL) allows the cloud user’s IP from the VPC CIDR, credentials are valid, and TLS cert (if required) is valid. How:</w:t>
-      </w:r>
-      <w:r>
-        <w:t xml:space="preserve"> </w:t>
-      </w:r>
-      <w:r>
-        <w:rPr>
-          <w:rStyle w:val="VerbatimChar"/>
-        </w:rPr>
-        <w:t xml:space="preserve">netstat -lntp</w:t>
-      </w:r>
-      <w:r>
-        <w:t xml:space="preserve"> </w:t>
-      </w:r>
-      <w:r>
-        <w:t xml:space="preserve">on the DB server to verify listener; DB server logs;</w:t>
-      </w:r>
-      <w:r>
-        <w:t xml:space="preserve"> </w:t>
-      </w:r>
-      <w:r>
-        <w:rPr>
-          <w:rStyle w:val="VerbatimChar"/>
-        </w:rPr>
-        <w:t xml:space="preserve">psql</w:t>
-      </w:r>
-      <w:r>
-        <w:t xml:space="preserve"> </w:t>
-      </w:r>
-      <w:r>
-        <w:t xml:space="preserve">/</w:t>
-      </w:r>
-      <w:r>
-        <w:t xml:space="preserve"> </w:t>
-      </w:r>
-      <w:r>
-        <w:rPr>
-          <w:rStyle w:val="VerbatimChar"/>
-        </w:rPr>
         <w:t xml:space="preserve">mysql</w:t>
       </w:r>
       <w:r>
         <w:t xml:space="preserve"> </w:t>
       </w:r>
       <w:r>
-        <w:t xml:space="preserve">client from the cloud to test authentication;</w:t>
-      </w:r>
-      <w:r>
-        <w:t xml:space="preserve"> </w:t>
-      </w:r>
-      <w:r>
-        <w:rPr>
-          <w:rStyle w:val="VerbatimChar"/>
-        </w:rPr>
-        <w:t xml:space="preserve">openssl s_client</w:t>
-      </w:r>
-      <w:r>
-        <w:t xml:space="preserve"> </w:t>
-      </w:r>
-      <w:r>
-        <w:t xml:space="preserve">to check TLS cert validity.</w:t>
+        <w:t xml:space="preserve">to see what error the database gives.</w:t>
       </w:r>
     </w:p>
     <w:bookmarkEnd w:id="14"/>
@@ -710,17 +682,7 @@
         <w:pStyle w:val="FirstParagraph"/>
       </w:pPr>
       <w:r>
-        <w:rPr>
-          <w:b/>
-          <w:bCs/>
-        </w:rPr>
-        <w:t xml:space="preserve">L1 — Physical.</w:t>
-      </w:r>
-      <w:r>
-        <w:t xml:space="preserve"> </w:t>
-      </w:r>
-      <w:r>
-        <w:t xml:space="preserve">Check cables, link lights, and on-prem switch ports. Cloud-side L1 is managed by AWS so assume it’s OK. Tools: eyeballs and switch console.</w:t>
+        <w:t xml:space="preserve">When something doesn’t work, start from the bottom and work your way up. If the cable is broken, there’s no point checking the database settings.</w:t>
       </w:r>
     </w:p>
     <w:p>
@@ -732,13 +694,37 @@
           <w:b/>
           <w:bCs/>
         </w:rPr>
-        <w:t xml:space="preserve">L2 — Data Link.</w:t>
-      </w:r>
-      <w:r>
-        <w:t xml:space="preserve"> </w:t>
-      </w:r>
-      <w:r>
-        <w:t xml:space="preserve">On-prem: check the switch VLAN is correct, ARP has an entry for the DB IP, and the DB’s MAC is learnt by the switch. Tools: switch CAM table,</w:t>
+        <w:t xml:space="preserve">Level 1 — Physical (cables and wires).</w:t>
+      </w:r>
+      <w:r>
+        <w:t xml:space="preserve"> </w:t>
+      </w:r>
+      <w:r>
+        <w:t xml:space="preserve">Check that cables are plugged in, lights are on, and the on-prem equipment is powered on. AWS handles this for us on their side, so we assume it’s fine. This is literally</w:t>
+      </w:r>
+      <w:r>
+        <w:t xml:space="preserve"> </w:t>
+      </w:r>
+      <w:r>
+        <w:t xml:space="preserve">“look at the hardware.”</w:t>
+      </w:r>
+    </w:p>
+    <w:p>
+      <w:pPr>
+        <w:pStyle w:val="BodyText"/>
+      </w:pPr>
+      <w:r>
+        <w:rPr>
+          <w:b/>
+          <w:bCs/>
+        </w:rPr>
+        <w:t xml:space="preserve">Level 2 — Local network (switches and MAC addresses).</w:t>
+      </w:r>
+      <w:r>
+        <w:t xml:space="preserve"> </w:t>
+      </w:r>
+      <w:r>
+        <w:t xml:space="preserve">On-prem: the network switch needs to know which cable the database server is plugged into. Check that the database server is plugged into the right switch port on the right network segment (VLAN). Tools: look at the switch console; run</w:t>
       </w:r>
       <w:r>
         <w:t xml:space="preserve"> </w:t>
@@ -753,7 +739,7 @@
         <w:t xml:space="preserve"> </w:t>
       </w:r>
       <w:r>
-        <w:t xml:space="preserve">command.</w:t>
+        <w:t xml:space="preserve">to see if the database IP is known.</w:t>
       </w:r>
     </w:p>
     <w:p>
@@ -765,13 +751,49 @@
           <w:b/>
           <w:bCs/>
         </w:rPr>
-        <w:t xml:space="preserve">L3 — Network.</w:t>
-      </w:r>
-      <w:r>
-        <w:t xml:space="preserve"> </w:t>
-      </w:r>
-      <w:r>
-        <w:t xml:space="preserve">Check route tables (both cloud and on-prem), VPN tunnel is UP, no CIDR overlap between VPC and on-prem, return route from on-prem to AWS exists, ICMP ping works. Tools:</w:t>
+        <w:t xml:space="preserve">Level 3 — Routing (getting packets across the internet).</w:t>
+      </w:r>
+      <w:r>
+        <w:t xml:space="preserve"> </w:t>
+      </w:r>
+      <w:r>
+        <w:t xml:space="preserve">Both cloud and on-prem need to know</w:t>
+      </w:r>
+      <w:r>
+        <w:t xml:space="preserve"> </w:t>
+      </w:r>
+      <w:r>
+        <w:t xml:space="preserve">“how do I send packets to the other side?”</w:t>
+      </w:r>
+      <w:r>
+        <w:t xml:space="preserve"> </w:t>
+      </w:r>
+      <w:r>
+        <w:t xml:space="preserve">In the cloud, the route table says</w:t>
+      </w:r>
+      <w:r>
+        <w:t xml:space="preserve"> </w:t>
+      </w:r>
+      <w:r>
+        <w:t xml:space="preserve">“on-prem traffic goes through the VPN.”</w:t>
+      </w:r>
+      <w:r>
+        <w:t xml:space="preserve"> </w:t>
+      </w:r>
+      <w:r>
+        <w:t xml:space="preserve">On-prem, the router needs a similar entry saying</w:t>
+      </w:r>
+      <w:r>
+        <w:t xml:space="preserve"> </w:t>
+      </w:r>
+      <w:r>
+        <w:t xml:space="preserve">“cloud traffic goes out this way.”</w:t>
+      </w:r>
+      <w:r>
+        <w:t xml:space="preserve"> </w:t>
+      </w:r>
+      <w:r>
+        <w:t xml:space="preserve">Also check: is the VPN tunnel UP? Do the cloud and on-prem networks use different IP ranges (if they overlap, routing gets confused). Tools:</w:t>
       </w:r>
       <w:r>
         <w:t xml:space="preserve"> </w:t>
@@ -784,7 +806,10 @@
         <w:t xml:space="preserve">VPC Reachability Analyzer</w:t>
       </w:r>
       <w:r>
-        <w:t xml:space="preserve">,</w:t>
+        <w:t xml:space="preserve"> </w:t>
+      </w:r>
+      <w:r>
+        <w:t xml:space="preserve">(AWS tool to test if traffic can flow); run</w:t>
       </w:r>
       <w:r>
         <w:t xml:space="preserve"> </w:t>
@@ -796,7 +821,10 @@
         <w:t xml:space="preserve">traceroute</w:t>
       </w:r>
       <w:r>
-        <w:t xml:space="preserve">,</w:t>
+        <w:t xml:space="preserve"> </w:t>
+      </w:r>
+      <w:r>
+        <w:t xml:space="preserve">(shows the path a packet takes);</w:t>
       </w:r>
       <w:r>
         <w:t xml:space="preserve"> </w:t>
@@ -808,7 +836,10 @@
         <w:t xml:space="preserve">aws ec2 describe-vpn-connections</w:t>
       </w:r>
       <w:r>
-        <w:t xml:space="preserve">.</w:t>
+        <w:t xml:space="preserve"> </w:t>
+      </w:r>
+      <w:r>
+        <w:t xml:space="preserve">(checks if the VPN tunnel is UP).</w:t>
       </w:r>
     </w:p>
     <w:p>
@@ -820,13 +851,25 @@
           <w:b/>
           <w:bCs/>
         </w:rPr>
-        <w:t xml:space="preserve">L4 — Transport.</w:t>
-      </w:r>
-      <w:r>
-        <w:t xml:space="preserve"> </w:t>
-      </w:r>
-      <w:r>
-        <w:t xml:space="preserve">Check Security Group + NACL allow outbound to the DB port and return traffic (NACLs are stateless, easy to miss the return rule), on-prem firewall allows inbound from the VPC CIDR, TCP handshake completes. Tools:</w:t>
+        <w:t xml:space="preserve">Level 4 — Firewall rules.</w:t>
+      </w:r>
+      <w:r>
+        <w:t xml:space="preserve"> </w:t>
+      </w:r>
+      <w:r>
+        <w:t xml:space="preserve">The cloud Security Group (firewall) must allow traffic OUT to the database port (5432). On-prem, the office firewall must allow traffic IN from the cloud on the same port. A common mistake: the outbound rule says</w:t>
+      </w:r>
+      <w:r>
+        <w:t xml:space="preserve"> </w:t>
+      </w:r>
+      <w:r>
+        <w:t xml:space="preserve">“allow port 5432 out”</w:t>
+      </w:r>
+      <w:r>
+        <w:t xml:space="preserve"> </w:t>
+      </w:r>
+      <w:r>
+        <w:t xml:space="preserve">but the return traffic (responses from the database) is blocked. Tools:</w:t>
       </w:r>
       <w:r>
         <w:t xml:space="preserve"> </w:t>
@@ -841,7 +884,7 @@
         <w:t xml:space="preserve"> </w:t>
       </w:r>
       <w:r>
-        <w:t xml:space="preserve">from cloud to test TCP handshake;</w:t>
+        <w:t xml:space="preserve">from the cloud (tests if the connection handshake works);</w:t>
       </w:r>
       <w:r>
         <w:t xml:space="preserve"> </w:t>
@@ -857,7 +900,7 @@
         <w:t xml:space="preserve"> </w:t>
       </w:r>
       <w:r>
-        <w:t xml:space="preserve">to find REJECT packets.</w:t>
+        <w:t xml:space="preserve">(shows if packets are being rejected).</w:t>
       </w:r>
     </w:p>
     <w:p>
@@ -869,13 +912,13 @@
           <w:b/>
           <w:bCs/>
         </w:rPr>
-        <w:t xml:space="preserve">L5/L6 — Session / Presentation (TLS).</w:t>
-      </w:r>
-      <w:r>
-        <w:t xml:space="preserve"> </w:t>
-      </w:r>
-      <w:r>
-        <w:t xml:space="preserve">If the DB requires TLS: check the certificate is valid, trusted, and the hostname matches; SNI is sent. Tools:</w:t>
+        <w:t xml:space="preserve">Level 5/6 — Encrypted connection (TLS).</w:t>
+      </w:r>
+      <w:r>
+        <w:t xml:space="preserve"> </w:t>
+      </w:r>
+      <w:r>
+        <w:t xml:space="preserve">If the database requires a secure encrypted connection, check that the encryption certificate is valid and not expired. Tools:</w:t>
       </w:r>
       <w:r>
         <w:t xml:space="preserve"> </w:t>
@@ -887,7 +930,10 @@
         <w:t xml:space="preserve">openssl s_client -connect db:5432</w:t>
       </w:r>
       <w:r>
-        <w:t xml:space="preserve">.</w:t>
+        <w:t xml:space="preserve"> </w:t>
+      </w:r>
+      <w:r>
+        <w:t xml:space="preserve">(shows the certificate details).</w:t>
       </w:r>
     </w:p>
     <w:p>
@@ -899,28 +945,25 @@
           <w:b/>
           <w:bCs/>
         </w:rPr>
-        <w:t xml:space="preserve">L7 — Application.</w:t>
-      </w:r>
-      <w:r>
-        <w:t xml:space="preserve"> </w:t>
-      </w:r>
-      <w:r>
-        <w:t xml:space="preserve">Check the DB listener is running on the right port,</w:t>
-      </w:r>
-      <w:r>
-        <w:t xml:space="preserve"> </w:t>
+        <w:t xml:space="preserve">Level 7 — Application (database itself).</w:t>
+      </w:r>
+      <w:r>
+        <w:t xml:space="preserve"> </w:t>
+      </w:r>
+      <w:r>
+        <w:t xml:space="preserve">The database must be listening for connections, and it must allow the cloud app’s IP address to connect. Check that the database process is actually running, the username/password are correct, and the hostname resolves to the right IP. Tools: log in to the database server and use the database client (</w:t>
       </w:r>
       <w:r>
         <w:rPr>
           <w:rStyle w:val="VerbatimChar"/>
         </w:rPr>
-        <w:t xml:space="preserve">pg_hba.conf</w:t>
-      </w:r>
-      <w:r>
-        <w:t xml:space="preserve"> </w:t>
-      </w:r>
-      <w:r>
-        <w:t xml:space="preserve">(PostgreSQL) /</w:t>
+        <w:t xml:space="preserve">psql</w:t>
+      </w:r>
+      <w:r>
+        <w:t xml:space="preserve"> </w:t>
+      </w:r>
+      <w:r>
+        <w:t xml:space="preserve">for PostgreSQL,</w:t>
       </w:r>
       <w:r>
         <w:t xml:space="preserve"> </w:t>
@@ -929,13 +972,121 @@
         <w:rPr>
           <w:rStyle w:val="VerbatimChar"/>
         </w:rPr>
-        <w:t xml:space="preserve">GRANT</w:t>
-      </w:r>
-      <w:r>
-        <w:t xml:space="preserve"> </w:t>
-      </w:r>
-      <w:r>
-        <w:t xml:space="preserve">(MySQL) permits the cloud user from the VPC CIDR, credentials are valid, DNS resolves the hostname. Tools:</w:t>
+        <w:t xml:space="preserve">mysql</w:t>
+      </w:r>
+      <w:r>
+        <w:t xml:space="preserve"> </w:t>
+      </w:r>
+      <w:r>
+        <w:t xml:space="preserve">for MySQL); check the database logs for errors.</w:t>
+      </w:r>
+    </w:p>
+    <w:bookmarkEnd w:id="15"/>
+    <w:bookmarkStart w:id="16" w:name="X4d807841ceeebd476dd35822dd758962d5262b2"/>
+    <w:p>
+      <w:pPr>
+        <w:pStyle w:val="Heading3"/>
+      </w:pPr>
+      <w:r>
+        <w:t xml:space="preserve">3.3 What to check: devices, modules, networks, services, and tools</w:t>
+      </w:r>
+    </w:p>
+    <w:p>
+      <w:pPr>
+        <w:pStyle w:val="FirstParagraph"/>
+      </w:pPr>
+      <w:r>
+        <w:t xml:space="preserve">To be thorough, here’s what you need to investigate:</w:t>
+      </w:r>
+    </w:p>
+    <w:p>
+      <w:pPr>
+        <w:numPr>
+          <w:ilvl w:val="0"/>
+          <w:numId w:val="1004"/>
+        </w:numPr>
+      </w:pPr>
+      <w:r>
+        <w:rPr>
+          <w:b/>
+          <w:bCs/>
+        </w:rPr>
+        <w:t xml:space="preserve">Devices (physical things)</w:t>
+      </w:r>
+      <w:r>
+        <w:t xml:space="preserve">: the cloud server running the app (EC2 or Lambda), the VPN gateway in AWS, the office firewall, the office router, the network switch, and the database server itself.</w:t>
+      </w:r>
+    </w:p>
+    <w:p>
+      <w:pPr>
+        <w:numPr>
+          <w:ilvl w:val="0"/>
+          <w:numId w:val="1004"/>
+        </w:numPr>
+      </w:pPr>
+      <w:r>
+        <w:rPr>
+          <w:b/>
+          <w:bCs/>
+        </w:rPr>
+        <w:t xml:space="preserve">Configuration modules (settings)</w:t>
+      </w:r>
+      <w:r>
+        <w:t xml:space="preserve">: the VPN tunnel encryption settings (both sides), the routing rules (how packets should flow), the firewall rules (what traffic is allowed).</w:t>
+      </w:r>
+    </w:p>
+    <w:p>
+      <w:pPr>
+        <w:numPr>
+          <w:ilvl w:val="0"/>
+          <w:numId w:val="1004"/>
+        </w:numPr>
+      </w:pPr>
+      <w:r>
+        <w:rPr>
+          <w:b/>
+          <w:bCs/>
+        </w:rPr>
+        <w:t xml:space="preserve">Networks (the paths between things)</w:t>
+      </w:r>
+      <w:r>
+        <w:t xml:space="preserve">: the cloud network IP range (CIDR), the on-prem network IP range, and the internet connection path between AWS and your office.</w:t>
+      </w:r>
+    </w:p>
+    <w:p>
+      <w:pPr>
+        <w:numPr>
+          <w:ilvl w:val="0"/>
+          <w:numId w:val="1004"/>
+        </w:numPr>
+      </w:pPr>
+      <w:r>
+        <w:rPr>
+          <w:b/>
+          <w:bCs/>
+        </w:rPr>
+        <w:t xml:space="preserve">AWS services and tools</w:t>
+      </w:r>
+      <w:r>
+        <w:t xml:space="preserve">: VPC Reachability Analyzer (tests if packets can flow), CloudWatch (shows if the VPN tunnel is up), VPC Flow Logs (shows if packets are being rejected), Route 53 (DNS — so hostnames resolve to IP addresses).</w:t>
+      </w:r>
+    </w:p>
+    <w:p>
+      <w:pPr>
+        <w:numPr>
+          <w:ilvl w:val="0"/>
+          <w:numId w:val="1004"/>
+        </w:numPr>
+      </w:pPr>
+      <w:r>
+        <w:rPr>
+          <w:b/>
+          <w:bCs/>
+        </w:rPr>
+        <w:t xml:space="preserve">Software tools you run</w:t>
+      </w:r>
+      <w:r>
+        <w:t xml:space="preserve">:</w:t>
       </w:r>
       <w:r>
         <w:t xml:space="preserve"> </w:t>
@@ -944,18 +1095,57 @@
         <w:rPr>
           <w:rStyle w:val="VerbatimChar"/>
         </w:rPr>
+        <w:t xml:space="preserve">ping</w:t>
+      </w:r>
+      <w:r>
+        <w:t xml:space="preserve"> </w:t>
+      </w:r>
+      <w:r>
+        <w:t xml:space="preserve">(test if a server is reachable),</w:t>
+      </w:r>
+      <w:r>
+        <w:t xml:space="preserve"> </w:t>
+      </w:r>
+      <w:r>
+        <w:rPr>
+          <w:rStyle w:val="VerbatimChar"/>
+        </w:rPr>
+        <w:t xml:space="preserve">traceroute</w:t>
+      </w:r>
+      <w:r>
+        <w:t xml:space="preserve"> </w:t>
+      </w:r>
+      <w:r>
+        <w:t xml:space="preserve">(see the path),</w:t>
+      </w:r>
+      <w:r>
+        <w:t xml:space="preserve"> </w:t>
+      </w:r>
+      <w:r>
+        <w:rPr>
+          <w:rStyle w:val="VerbatimChar"/>
+        </w:rPr>
+        <w:t xml:space="preserve">telnet</w:t>
+      </w:r>
+      <w:r>
+        <w:t xml:space="preserve"> </w:t>
+      </w:r>
+      <w:r>
+        <w:t xml:space="preserve">(test if you can connect to a port),</w:t>
+      </w:r>
+      <w:r>
+        <w:t xml:space="preserve"> </w:t>
+      </w:r>
+      <w:r>
+        <w:rPr>
+          <w:rStyle w:val="VerbatimChar"/>
+        </w:rPr>
         <w:t xml:space="preserve">psql</w:t>
       </w:r>
       <w:r>
-        <w:t xml:space="preserve"> </w:t>
-      </w:r>
-      <w:r>
         <w:t xml:space="preserve">/</w:t>
       </w:r>
       <w:r>
-        <w:t xml:space="preserve"> </w:t>
-      </w:r>
-      <w:r>
         <w:rPr>
           <w:rStyle w:val="VerbatimChar"/>
         </w:rPr>
@@ -965,17 +1155,32 @@
         <w:t xml:space="preserve"> </w:t>
       </w:r>
       <w:r>
-        <w:t xml:space="preserve">client from cloud; on-prem DB logs.</w:t>
-      </w:r>
-    </w:p>
-    <w:bookmarkEnd w:id="15"/>
-    <w:bookmarkStart w:id="16" w:name="X65283061df29e307c41fa1402f408bdfb80e6d6"/>
+        <w:t xml:space="preserve">(database clients to test the actual connection),</w:t>
+      </w:r>
+      <w:r>
+        <w:t xml:space="preserve"> </w:t>
+      </w:r>
+      <w:r>
+        <w:rPr>
+          <w:rStyle w:val="VerbatimChar"/>
+        </w:rPr>
+        <w:t xml:space="preserve">aws ec2 describe-vpn-connections</w:t>
+      </w:r>
+      <w:r>
+        <w:t xml:space="preserve"> </w:t>
+      </w:r>
+      <w:r>
+        <w:t xml:space="preserve">(AWS CLI command to check tunnel status).</w:t>
+      </w:r>
+    </w:p>
+    <w:bookmarkEnd w:id="16"/>
+    <w:bookmarkStart w:id="17" w:name="start-with-the-quickest-checks"/>
     <w:p>
       <w:pPr>
         <w:pStyle w:val="Heading3"/>
       </w:pPr>
       <w:r>
-        <w:t xml:space="preserve">3.3 Devices, modules, networks, services, software (the question’s list)</w:t>
+        <w:t xml:space="preserve">3.4 Start with the quickest checks</w:t>
       </w:r>
     </w:p>
     <w:p>
@@ -983,229 +1188,96 @@
         <w:pStyle w:val="FirstParagraph"/>
       </w:pPr>
       <w:r>
-        <w:t xml:space="preserve">The question explicitly asks me to enumerate which of each to investigate:</w:t>
-      </w:r>
-    </w:p>
-    <w:p>
-      <w:pPr>
-        <w:pStyle w:val="Compact"/>
-        <w:numPr>
-          <w:ilvl w:val="0"/>
-          <w:numId w:val="1004"/>
-        </w:numPr>
-      </w:pPr>
-      <w:r>
-        <w:rPr>
-          <w:b/>
-          <w:bCs/>
-        </w:rPr>
-        <w:t xml:space="preserve">Devices</w:t>
-      </w:r>
-      <w:r>
-        <w:t xml:space="preserve">: cloud Lambda/EC2 instance, VPC route table, Virtual Private Gateway, on-prem firewall, on-prem router, on-prem switch, DB server.</w:t>
-      </w:r>
-    </w:p>
-    <w:p>
-      <w:pPr>
-        <w:pStyle w:val="Compact"/>
-        <w:numPr>
-          <w:ilvl w:val="0"/>
-          <w:numId w:val="1004"/>
-        </w:numPr>
-      </w:pPr>
-      <w:r>
-        <w:rPr>
-          <w:b/>
-          <w:bCs/>
-        </w:rPr>
-        <w:t xml:space="preserve">Modules</w:t>
-      </w:r>
-      <w:r>
-        <w:t xml:space="preserve">: IPsec tunnel (IKE phase 1, IPsec phase 2), BGP/static routing module on the VGW, on-prem VPN endpoint module.</w:t>
-      </w:r>
-    </w:p>
-    <w:p>
-      <w:pPr>
-        <w:pStyle w:val="Compact"/>
-        <w:numPr>
-          <w:ilvl w:val="0"/>
-          <w:numId w:val="1004"/>
-        </w:numPr>
-      </w:pPr>
-      <w:r>
-        <w:rPr>
-          <w:b/>
-          <w:bCs/>
-        </w:rPr>
-        <w:t xml:space="preserve">Networks</w:t>
-      </w:r>
-      <w:r>
-        <w:t xml:space="preserve">: AWS VPC CIDR, on-prem subnet CIDR, internet path between VGW public IP and on-prem public IP.</w:t>
-      </w:r>
-    </w:p>
-    <w:p>
-      <w:pPr>
-        <w:pStyle w:val="Compact"/>
-        <w:numPr>
-          <w:ilvl w:val="0"/>
-          <w:numId w:val="1004"/>
-        </w:numPr>
-      </w:pPr>
-      <w:r>
-        <w:rPr>
-          <w:b/>
-          <w:bCs/>
-        </w:rPr>
-        <w:t xml:space="preserve">Services</w:t>
-      </w:r>
-      <w:r>
-        <w:t xml:space="preserve">: VPC Reachability Analyzer, CloudWatch (</w:t>
-      </w:r>
+        <w:t xml:space="preserve">Instead of checking everything at once, start with the three things most likely to be the problem:</w:t>
+      </w:r>
+    </w:p>
+    <w:p>
+      <w:pPr>
+        <w:numPr>
+          <w:ilvl w:val="0"/>
+          <w:numId w:val="1005"/>
+        </w:numPr>
+      </w:pPr>
       <w:r>
         <w:rPr>
           <w:rStyle w:val="VerbatimChar"/>
-        </w:rPr>
-        <w:t xml:space="preserve">TunnelState</w:t>
-      </w:r>
-      <w:r>
-        <w:t xml:space="preserve"> </w:t>
-      </w:r>
-      <w:r>
-        <w:t xml:space="preserve">metric, Lambda logs), CloudTrail, VPC Flow Logs, DNS (Route 53 Resolver / on-prem DNS).</w:t>
-      </w:r>
-    </w:p>
-    <w:p>
-      <w:pPr>
-        <w:pStyle w:val="Compact"/>
-        <w:numPr>
-          <w:ilvl w:val="0"/>
-          <w:numId w:val="1004"/>
-        </w:numPr>
-      </w:pPr>
-      <w:r>
-        <w:rPr>
-          <w:b/>
-          <w:bCs/>
-        </w:rPr>
-        <w:t xml:space="preserve">Software</w:t>
-      </w:r>
-      <w:r>
-        <w:t xml:space="preserve">:</w:t>
-      </w:r>
-      <w:r>
-        <w:t xml:space="preserve"> </w:t>
-      </w:r>
+          <w:b/>
+          <w:bCs/>
+        </w:rPr>
+        <w:t xml:space="preserve">aws ec2 describe-vpn-connections</w:t>
+      </w:r>
+      <w:r>
+        <w:t xml:space="preserve"> </w:t>
+      </w:r>
+      <w:r>
+        <w:t xml:space="preserve">— is the VPN tunnel even UP? This is the #1 cause of</w:t>
+      </w:r>
+      <w:r>
+        <w:t xml:space="preserve"> </w:t>
+      </w:r>
+      <w:r>
+        <w:t xml:space="preserve">“cloud can’t reach on-prem”</w:t>
+      </w:r>
+      <w:r>
+        <w:t xml:space="preserve"> </w:t>
+      </w:r>
+      <w:r>
+        <w:t xml:space="preserve">problems. Takes 10 seconds to check. If the tunnel is down, everything else is pointless.</w:t>
+      </w:r>
+    </w:p>
+    <w:p>
+      <w:pPr>
+        <w:numPr>
+          <w:ilvl w:val="0"/>
+          <w:numId w:val="1005"/>
+        </w:numPr>
+      </w:pPr>
+      <w:r>
+        <w:rPr>
+          <w:b/>
+          <w:bCs/>
+        </w:rPr>
+        <w:t xml:space="preserve">VPC Reachability Analyzer</w:t>
+      </w:r>
+      <w:r>
+        <w:t xml:space="preserve"> </w:t>
+      </w:r>
+      <w:r>
+        <w:t xml:space="preserve">(AWS tool) — tell it</w:t>
+      </w:r>
+      <w:r>
+        <w:t xml:space="preserve"> </w:t>
+      </w:r>
+      <w:r>
+        <w:t xml:space="preserve">“I want to send traffic from my cloud app to the on-prem database”</w:t>
+      </w:r>
+      <w:r>
+        <w:t xml:space="preserve"> </w:t>
+      </w:r>
+      <w:r>
+        <w:t xml:space="preserve">and it will tell you exactly which step is failing. Very useful because it narrows down from 5 hops to 1.</w:t>
+      </w:r>
+    </w:p>
+    <w:p>
+      <w:pPr>
+        <w:numPr>
+          <w:ilvl w:val="0"/>
+          <w:numId w:val="1005"/>
+        </w:numPr>
+      </w:pPr>
       <w:r>
         <w:rPr>
           <w:rStyle w:val="VerbatimChar"/>
-        </w:rPr>
-        <w:t xml:space="preserve">ping</w:t>
-      </w:r>
-      <w:r>
-        <w:t xml:space="preserve">,</w:t>
-      </w:r>
-      <w:r>
-        <w:t xml:space="preserve"> </w:t>
-      </w:r>
-      <w:r>
-        <w:rPr>
-          <w:rStyle w:val="VerbatimChar"/>
-        </w:rPr>
-        <w:t xml:space="preserve">traceroute</w:t>
-      </w:r>
-      <w:r>
-        <w:t xml:space="preserve">,</w:t>
-      </w:r>
-      <w:r>
-        <w:t xml:space="preserve"> </w:t>
-      </w:r>
-      <w:r>
-        <w:rPr>
-          <w:rStyle w:val="VerbatimChar"/>
-        </w:rPr>
-        <w:t xml:space="preserve">telnet</w:t>
-      </w:r>
-      <w:r>
-        <w:t xml:space="preserve">,</w:t>
-      </w:r>
-      <w:r>
-        <w:t xml:space="preserve"> </w:t>
-      </w:r>
-      <w:r>
-        <w:rPr>
-          <w:rStyle w:val="VerbatimChar"/>
-        </w:rPr>
-        <w:t xml:space="preserve">nc</w:t>
-      </w:r>
-      <w:r>
-        <w:t xml:space="preserve">,</w:t>
-      </w:r>
-      <w:r>
-        <w:t xml:space="preserve"> </w:t>
-      </w:r>
-      <w:r>
-        <w:rPr>
-          <w:rStyle w:val="VerbatimChar"/>
-        </w:rPr>
-        <w:t xml:space="preserve">openssl s_client</w:t>
-      </w:r>
-      <w:r>
-        <w:t xml:space="preserve">,</w:t>
-      </w:r>
-      <w:r>
-        <w:t xml:space="preserve"> </w:t>
-      </w:r>
-      <w:r>
-        <w:rPr>
-          <w:rStyle w:val="VerbatimChar"/>
-        </w:rPr>
-        <w:t xml:space="preserve">dig</w:t>
-      </w:r>
-      <w:r>
-        <w:t xml:space="preserve">,</w:t>
-      </w:r>
-      <w:r>
-        <w:t xml:space="preserve"> </w:t>
-      </w:r>
-      <w:r>
-        <w:rPr>
-          <w:rStyle w:val="VerbatimChar"/>
-        </w:rPr>
-        <w:t xml:space="preserve">psql</w:t>
-      </w:r>
-      <w:r>
-        <w:t xml:space="preserve">/</w:t>
-      </w:r>
-      <w:r>
-        <w:rPr>
-          <w:rStyle w:val="VerbatimChar"/>
-        </w:rPr>
-        <w:t xml:space="preserve">mysql</w:t>
-      </w:r>
-      <w:r>
-        <w:t xml:space="preserve"> </w:t>
-      </w:r>
-      <w:r>
-        <w:t xml:space="preserve">client, AWS CLI (</w:t>
-      </w:r>
-      <w:r>
-        <w:rPr>
-          <w:rStyle w:val="VerbatimChar"/>
-        </w:rPr>
-        <w:t xml:space="preserve">aws ec2 describe-vpn-connections</w:t>
-      </w:r>
-      <w:r>
-        <w:t xml:space="preserve">).</w:t>
-      </w:r>
-    </w:p>
-    <w:bookmarkEnd w:id="16"/>
-    <w:bookmarkStart w:id="17" w:name="the-first-three-commands-id-actually-run"/>
-    <w:p>
-      <w:pPr>
-        <w:pStyle w:val="Heading3"/>
-      </w:pPr>
-      <w:r>
-        <w:t xml:space="preserve">3.4 The first three commands I’d actually run</w:t>
+          <w:b/>
+          <w:bCs/>
+        </w:rPr>
+        <w:t xml:space="preserve">telnet on-prem-db-ip 5432</w:t>
+      </w:r>
+      <w:r>
+        <w:t xml:space="preserve"> </w:t>
+      </w:r>
+      <w:r>
+        <w:t xml:space="preserve">from a cloud instance — try to open a connection to the database. If it works, you know the network is OK and the problem is probably credentials or the database config. If it fails, you know the network itself is broken and you need to go back and check the firewall rules and routing.</w:t>
       </w:r>
     </w:p>
     <w:p>
@@ -1213,99 +1285,7 @@
         <w:pStyle w:val="FirstParagraph"/>
       </w:pPr>
       <w:r>
-        <w:t xml:space="preserve">A senior engineer doesn’t read the full checklist top to bottom every time. The fastest first three checks:</w:t>
-      </w:r>
-    </w:p>
-    <w:p>
-      <w:pPr>
-        <w:pStyle w:val="Compact"/>
-        <w:numPr>
-          <w:ilvl w:val="0"/>
-          <w:numId w:val="1005"/>
-        </w:numPr>
-      </w:pPr>
-      <w:r>
-        <w:rPr>
-          <w:rStyle w:val="VerbatimChar"/>
-          <w:b/>
-          <w:bCs/>
-        </w:rPr>
-        <w:t xml:space="preserve">aws ec2 describe-vpn-connections</w:t>
-      </w:r>
-      <w:r>
-        <w:t xml:space="preserve"> </w:t>
-      </w:r>
-      <w:r>
-        <w:t xml:space="preserve">— is the tunnel even up? Solves ~50% of these incidents in ten seconds.</w:t>
-      </w:r>
-    </w:p>
-    <w:p>
-      <w:pPr>
-        <w:pStyle w:val="Compact"/>
-        <w:numPr>
-          <w:ilvl w:val="0"/>
-          <w:numId w:val="1005"/>
-        </w:numPr>
-      </w:pPr>
-      <w:r>
-        <w:rPr>
-          <w:b/>
-          <w:bCs/>
-        </w:rPr>
-        <w:t xml:space="preserve">VPC Reachability Analyzer</w:t>
-      </w:r>
-      <w:r>
-        <w:t xml:space="preserve"> </w:t>
-      </w:r>
-      <w:r>
-        <w:t xml:space="preserve">with source = the Lambda’s ENI and destination = on-prem DB IP/port — AWS will tell you</w:t>
-      </w:r>
-      <w:r>
-        <w:t xml:space="preserve"> </w:t>
-      </w:r>
-      <w:r>
-        <w:rPr>
-          <w:i/>
-          <w:iCs/>
-        </w:rPr>
-        <w:t xml:space="preserve">exactly</w:t>
-      </w:r>
-      <w:r>
-        <w:t xml:space="preserve"> </w:t>
-      </w:r>
-      <w:r>
-        <w:t xml:space="preserve">which hop is blocking.</w:t>
-      </w:r>
-    </w:p>
-    <w:p>
-      <w:pPr>
-        <w:pStyle w:val="Compact"/>
-        <w:numPr>
-          <w:ilvl w:val="0"/>
-          <w:numId w:val="1005"/>
-        </w:numPr>
-      </w:pPr>
-      <w:r>
-        <w:rPr>
-          <w:rStyle w:val="VerbatimChar"/>
-          <w:b/>
-          <w:bCs/>
-        </w:rPr>
-        <w:t xml:space="preserve">telnet on-prem-db-ip 5432</w:t>
-      </w:r>
-      <w:r>
-        <w:t xml:space="preserve"> </w:t>
-      </w:r>
-      <w:r>
-        <w:t xml:space="preserve">from a cloud test instance — if TCP handshake succeeds, it’s an app-layer problem (creds, GRANT). If it fails, it’s a network-layer problem.</w:t>
-      </w:r>
-    </w:p>
-    <w:p>
-      <w:pPr>
-        <w:pStyle w:val="FirstParagraph"/>
-      </w:pPr>
-      <w:r>
-        <w:t xml:space="preserve">These three pin down the layer in &lt; 5 minutes.</w:t>
+        <w:t xml:space="preserve">These three quick checks usually tell you which layer is broken, and then you can focus your investigation there.</w:t>
       </w:r>
     </w:p>
     <w:p>
@@ -1331,7 +1311,7 @@
         <w:pStyle w:val="FirstParagraph"/>
       </w:pPr>
       <w:r>
-        <w:t xml:space="preserve">Common causes, listed roughly most-likely-first:</w:t>
+        <w:t xml:space="preserve">When cloud can’t reach on-prem, here are the most common causes (listed by likelihood):</w:t>
       </w:r>
     </w:p>
     <w:p>
@@ -1346,13 +1326,13 @@
           <w:b/>
           <w:bCs/>
         </w:rPr>
-        <w:t xml:space="preserve">VPN tunnel is down</w:t>
-      </w:r>
-      <w:r>
-        <w:t xml:space="preserve"> </w:t>
-      </w:r>
-      <w:r>
-        <w:t xml:space="preserve">(PSK or IPsec proposal mismatch) — L3. The tunnel state shows DOWN; pre-shared key or IKE/IPsec parameters don’t match between AWS and on-prem.</w:t>
+        <w:t xml:space="preserve">VPN tunnel is DOWN</w:t>
+      </w:r>
+      <w:r>
+        <w:t xml:space="preserve"> </w:t>
+      </w:r>
+      <w:r>
+        <w:t xml:space="preserve">— This is #1 because it’s the most common. The encrypted connection between AWS and your office isn’t established. Solution: check that the secret key and encryption settings match on both sides.</w:t>
       </w:r>
     </w:p>
     <w:p>
@@ -1367,13 +1347,25 @@
           <w:b/>
           <w:bCs/>
         </w:rPr>
-        <w:t xml:space="preserve">Route table missing route to on-prem CIDR via VGW</w:t>
-      </w:r>
-      <w:r>
-        <w:t xml:space="preserve"> </w:t>
-      </w:r>
-      <w:r>
-        <w:t xml:space="preserve">— L3. The VPC route table has no entry for the on-prem CIDR pointing to the Virtual Private Gateway.</w:t>
+        <w:t xml:space="preserve">Route table missing the on-prem route</w:t>
+      </w:r>
+      <w:r>
+        <w:t xml:space="preserve"> </w:t>
+      </w:r>
+      <w:r>
+        <w:t xml:space="preserve">— The cloud route table doesn’t have an entry that says</w:t>
+      </w:r>
+      <w:r>
+        <w:t xml:space="preserve"> </w:t>
+      </w:r>
+      <w:r>
+        <w:t xml:space="preserve">“traffic to the office network should go through the VPN tunnel.”</w:t>
+      </w:r>
+      <w:r>
+        <w:t xml:space="preserve"> </w:t>
+      </w:r>
+      <w:r>
+        <w:t xml:space="preserve">Solution: add the missing route.</w:t>
       </w:r>
     </w:p>
     <w:p>
@@ -1388,13 +1380,13 @@
           <w:b/>
           <w:bCs/>
         </w:rPr>
-        <w:t xml:space="preserve">Security Group blocks outbound to DB port</w:t>
-      </w:r>
-      <w:r>
-        <w:t xml:space="preserve"> </w:t>
-      </w:r>
-      <w:r>
-        <w:t xml:space="preserve">— L4. The EC2 / Lambda’s SG has no outbound rule permitting the on-prem DB CIDR on the DB port.</w:t>
+        <w:t xml:space="preserve">Cloud security group blocks outgoing traffic</w:t>
+      </w:r>
+      <w:r>
+        <w:t xml:space="preserve"> </w:t>
+      </w:r>
+      <w:r>
+        <w:t xml:space="preserve">— The EC2/Lambda’s firewall rule doesn’t allow traffic out on port 5432 (or whatever port the database uses). Solution: add an outgoing rule that allows this.</w:t>
       </w:r>
     </w:p>
     <w:p>
@@ -1409,29 +1401,13 @@
           <w:b/>
           <w:bCs/>
         </w:rPr>
-        <w:t xml:space="preserve">NACL blocks outbound or return traffic</w:t>
-      </w:r>
-      <w:r>
-        <w:t xml:space="preserve"> </w:t>
-      </w:r>
-      <w:r>
-        <w:t xml:space="preserve">— L4. NACLs are stateless, so both outbound</w:t>
-      </w:r>
-      <w:r>
-        <w:t xml:space="preserve"> </w:t>
-      </w:r>
-      <w:r>
-        <w:rPr>
-          <w:i/>
-          <w:iCs/>
-        </w:rPr>
-        <w:t xml:space="preserve">and</w:t>
-      </w:r>
-      <w:r>
-        <w:t xml:space="preserve"> </w:t>
-      </w:r>
-      <w:r>
-        <w:t xml:space="preserve">return traffic rules must be present. Easy to add outbound 5432 but forget the return rule.</w:t>
+        <w:t xml:space="preserve">Return traffic is blocked</w:t>
+      </w:r>
+      <w:r>
+        <w:t xml:space="preserve"> </w:t>
+      </w:r>
+      <w:r>
+        <w:t xml:space="preserve">— Traffic from cloud to office gets through, but the office’s response back to the cloud is blocked by the office firewall. Solution: make sure the office firewall allows return traffic on the same port.</w:t>
       </w:r>
     </w:p>
     <w:p>
@@ -1446,13 +1422,13 @@
           <w:b/>
           <w:bCs/>
         </w:rPr>
-        <w:t xml:space="preserve">On-prem firewall blocks inbound from VPC CIDR</w:t>
-      </w:r>
-      <w:r>
-        <w:t xml:space="preserve"> </w:t>
-      </w:r>
-      <w:r>
-        <w:t xml:space="preserve">— L4. The on-prem firewall ACL doesn’t allow inbound from the VPC CIDR on the DB port.</w:t>
+        <w:t xml:space="preserve">Office firewall blocks incoming traffic</w:t>
+      </w:r>
+      <w:r>
+        <w:t xml:space="preserve"> </w:t>
+      </w:r>
+      <w:r>
+        <w:t xml:space="preserve">— The office firewall rule doesn’t allow traffic from the AWS cloud network. Solution: add an inbound rule allowing the cloud’s IP range.</w:t>
       </w:r>
     </w:p>
     <w:p>
@@ -1467,13 +1443,13 @@
           <w:b/>
           <w:bCs/>
         </w:rPr>
-        <w:t xml:space="preserve">Asymmetric routing</w:t>
-      </w:r>
-      <w:r>
-        <w:t xml:space="preserve"> </w:t>
-      </w:r>
-      <w:r>
-        <w:t xml:space="preserve">— L3. Packets from cloud to on-prem get through, but return traffic takes a different path (e.g., via a different router) that doesn’t arrive back.</w:t>
+        <w:t xml:space="preserve">Packet goes out but never comes back</w:t>
+      </w:r>
+      <w:r>
+        <w:t xml:space="preserve"> </w:t>
+      </w:r>
+      <w:r>
+        <w:t xml:space="preserve">— Sometimes a packet reaches the destination but the return path is different, so the response never makes it back. This is rare but annoying to troubleshoot.</w:t>
       </w:r>
     </w:p>
     <w:p>
@@ -1488,13 +1464,13 @@
           <w:b/>
           <w:bCs/>
         </w:rPr>
-        <w:t xml:space="preserve">CIDR overlap between VPC and on-prem subnets</w:t>
-      </w:r>
-      <w:r>
-        <w:t xml:space="preserve"> </w:t>
-      </w:r>
-      <w:r>
-        <w:t xml:space="preserve">— L3. The VPC CIDR accidentally overlaps with the on-prem CIDR; routing becomes ambiguous.</w:t>
+        <w:t xml:space="preserve">IP ranges overlap</w:t>
+      </w:r>
+      <w:r>
+        <w:t xml:space="preserve"> </w:t>
+      </w:r>
+      <w:r>
+        <w:t xml:space="preserve">— The cloud network and office network accidentally use the same IP range (e.g., both use 10.0.0.0/16). The router doesn’t know which one you mean. Solution: change one of the IP ranges.</w:t>
       </w:r>
     </w:p>
     <w:p>
@@ -1509,13 +1485,25 @@
           <w:b/>
           <w:bCs/>
         </w:rPr>
-        <w:t xml:space="preserve">DNS resolution failure</w:t>
-      </w:r>
-      <w:r>
-        <w:t xml:space="preserve"> </w:t>
-      </w:r>
-      <w:r>
-        <w:t xml:space="preserve">— L7. The cloud Lambda cannot resolve the on-prem DB hostname because the VPC Resolver Endpoint is not configured to forward queries to on-prem DNS.</w:t>
+        <w:t xml:space="preserve">DNS can’t find the database hostname</w:t>
+      </w:r>
+      <w:r>
+        <w:t xml:space="preserve"> </w:t>
+      </w:r>
+      <w:r>
+        <w:t xml:space="preserve">— The cloud app says</w:t>
+      </w:r>
+      <w:r>
+        <w:t xml:space="preserve"> </w:t>
+      </w:r>
+      <w:r>
+        <w:t xml:space="preserve">“connect to database.company.com”</w:t>
+      </w:r>
+      <w:r>
+        <w:t xml:space="preserve"> </w:t>
+      </w:r>
+      <w:r>
+        <w:t xml:space="preserve">but that hostname doesn’t resolve to an IP address in the cloud. Solution: configure the cloud to ask the office’s DNS server for hostname lookups.</w:t>
       </w:r>
     </w:p>
     <w:p>
@@ -1530,13 +1518,13 @@
           <w:b/>
           <w:bCs/>
         </w:rPr>
-        <w:t xml:space="preserve">DB listener not running, on wrong port, or bound to localhost only</w:t>
-      </w:r>
-      <w:r>
-        <w:t xml:space="preserve"> </w:t>
-      </w:r>
-      <w:r>
-        <w:t xml:space="preserve">— L7. The database server is not listening, or is listening on a different port than the app expects, or is bound to 127.0.0.1 (won’t accept remote connections).</w:t>
+        <w:t xml:space="preserve">Database isn’t listening</w:t>
+      </w:r>
+      <w:r>
+        <w:t xml:space="preserve"> </w:t>
+      </w:r>
+      <w:r>
+        <w:t xml:space="preserve">— The database service isn’t running, or it’s listening on the wrong port, or it’s only listening to local connections (127.0.0.1). Solution: start the database or fix the port/settings.</w:t>
       </w:r>
     </w:p>
     <w:p>
@@ -1551,43 +1539,13 @@
           <w:b/>
           <w:bCs/>
         </w:rPr>
-        <w:t xml:space="preserve">DB auth refused</w:t>
-      </w:r>
-      <w:r>
-        <w:t xml:space="preserve"> </w:t>
-      </w:r>
-      <w:r>
-        <w:t xml:space="preserve">— L7. The cloud user’s IP address is not in</w:t>
-      </w:r>
-      <w:r>
-        <w:t xml:space="preserve"> </w:t>
-      </w:r>
-      <w:r>
-        <w:rPr>
-          <w:rStyle w:val="VerbatimChar"/>
-        </w:rPr>
-        <w:t xml:space="preserve">pg_hba.conf</w:t>
-      </w:r>
-      <w:r>
-        <w:t xml:space="preserve"> </w:t>
-      </w:r>
-      <w:r>
-        <w:t xml:space="preserve">(PostgreSQL) or does not have a</w:t>
-      </w:r>
-      <w:r>
-        <w:t xml:space="preserve"> </w:t>
-      </w:r>
-      <w:r>
-        <w:rPr>
-          <w:rStyle w:val="VerbatimChar"/>
-        </w:rPr>
-        <w:t xml:space="preserve">GRANT</w:t>
-      </w:r>
-      <w:r>
-        <w:t xml:space="preserve"> </w:t>
-      </w:r>
-      <w:r>
-        <w:t xml:space="preserve">(MySQL), or the credentials are wrong.</w:t>
+        <w:t xml:space="preserve">Database won’t let the cloud connect</w:t>
+      </w:r>
+      <w:r>
+        <w:t xml:space="preserve"> </w:t>
+      </w:r>
+      <w:r>
+        <w:t xml:space="preserve">— The database has its own access control (like pg_hba.conf in PostgreSQL). It doesn’t recognize the cloud app’s IP as a valid client. Solution: add the cloud’s IP to the database access list.</w:t>
       </w:r>
     </w:p>
     <w:p>
@@ -1602,13 +1560,13 @@
           <w:b/>
           <w:bCs/>
         </w:rPr>
-        <w:t xml:space="preserve">TLS / certificate problem</w:t>
-      </w:r>
-      <w:r>
-        <w:t xml:space="preserve"> </w:t>
-      </w:r>
-      <w:r>
-        <w:t xml:space="preserve">— L5/L6. The DB’s TLS certificate is invalid, expired, untrusted, or the hostname doesn’t match.</w:t>
+        <w:t xml:space="preserve">Certificate problem</w:t>
+      </w:r>
+      <w:r>
+        <w:t xml:space="preserve"> </w:t>
+      </w:r>
+      <w:r>
+        <w:t xml:space="preserve">— If the database requires an encrypted connection, the certificate might be expired or invalid. Solution: renew the certificate or disable certificate checking if it’s just for testing.</w:t>
       </w:r>
     </w:p>
     <w:p>
@@ -1623,13 +1581,13 @@
           <w:b/>
           <w:bCs/>
         </w:rPr>
-        <w:t xml:space="preserve">Lambda not configured to run in a VPC</w:t>
-      </w:r>
-      <w:r>
-        <w:t xml:space="preserve"> </w:t>
-      </w:r>
-      <w:r>
-        <w:t xml:space="preserve">— L3. The Lambda is running without an ENI in the VPC, so its outbound traffic goes via the public internet (NAT Gateway), never through the VPN tunnel.</w:t>
+        <w:t xml:space="preserve">Lambda runs outside the VPC</w:t>
+      </w:r>
+      <w:r>
+        <w:t xml:space="preserve"> </w:t>
+      </w:r>
+      <w:r>
+        <w:t xml:space="preserve">— The Lambda function isn’t configured to run inside the cloud’s network, so it goes out through the public internet instead of the VPN. Solution: configure the Lambda to run in a VPC.</w:t>
       </w:r>
     </w:p>
     <w:p>
@@ -1644,13 +1602,13 @@
           <w:b/>
           <w:bCs/>
         </w:rPr>
-        <w:t xml:space="preserve">MTU / fragmentation problem on the IPsec tunnel</w:t>
-      </w:r>
-      <w:r>
-        <w:t xml:space="preserve"> </w:t>
-      </w:r>
-      <w:r>
-        <w:t xml:space="preserve">— L3. The tunnel MTU is too small; packets are fragmented, causing performance issues or silent drops.</w:t>
+        <w:t xml:space="preserve">Network packet size problem</w:t>
+      </w:r>
+      <w:r>
+        <w:t xml:space="preserve"> </w:t>
+      </w:r>
+      <w:r>
+        <w:t xml:space="preserve">— The VPN tunnel has a size limit on packets. If you try to send a packet larger than this limit, it gets broken into pieces, and sometimes those pieces get lost. Solution: adjust the packet size or change the tunnel settings.</w:t>
       </w:r>
     </w:p>
     <w:p>
@@ -1675,41 +1633,52 @@
         <w:pStyle w:val="FirstParagraph"/>
       </w:pPr>
       <w:r>
-        <w:t xml:space="preserve">I picked</w:t>
-      </w:r>
-      <w:r>
-        <w:t xml:space="preserve"> </w:t>
-      </w:r>
-      <w:r>
-        <w:rPr>
-          <w:b/>
-          <w:bCs/>
-        </w:rPr>
-        <w:t xml:space="preserve">#1 — VPN tunnel is down</w:t>
-      </w:r>
-      <w:r>
-        <w:t xml:space="preserve"> </w:t>
-      </w:r>
-      <w:r>
-        <w:t xml:space="preserve">because it is the single most common cause of</w:t>
-      </w:r>
-      <w:r>
-        <w:t xml:space="preserve"> </w:t>
-      </w:r>
-      <w:r>
-        <w:t xml:space="preserve">“cloud cannot reach on-prem”</w:t>
-      </w:r>
-      <w:r>
-        <w:t xml:space="preserve">, and because it lets me show the full diagnostic + fix loop end-to-end.</w:t>
-      </w:r>
-    </w:p>
-    <w:bookmarkStart w:id="20" w:name="how-we-know-its-this-problem"/>
+        <w:t xml:space="preserve">I’m choosing</w:t>
+      </w:r>
+      <w:r>
+        <w:t xml:space="preserve"> </w:t>
+      </w:r>
+      <w:r>
+        <w:rPr>
+          <w:b/>
+          <w:bCs/>
+        </w:rPr>
+        <w:t xml:space="preserve">Problem #1 — VPN tunnel is down</w:t>
+      </w:r>
+      <w:r>
+        <w:t xml:space="preserve"> </w:t>
+      </w:r>
+      <w:r>
+        <w:t xml:space="preserve">because (1) it’s the most common cause of</w:t>
+      </w:r>
+      <w:r>
+        <w:t xml:space="preserve"> </w:t>
+      </w:r>
+      <w:r>
+        <w:t xml:space="preserve">“cloud can’t reach on-prem,”</w:t>
+      </w:r>
+      <w:r>
+        <w:t xml:space="preserve"> </w:t>
+      </w:r>
+      <w:r>
+        <w:t xml:space="preserve">and (2) it shows how to diagnose and fix a real problem from start to finish.</w:t>
+      </w:r>
+    </w:p>
+    <w:bookmarkStart w:id="20" w:name="how-you-know-its-this-problem"/>
     <w:p>
       <w:pPr>
         <w:pStyle w:val="Heading3"/>
       </w:pPr>
       <w:r>
-        <w:t xml:space="preserve">5.1 How we know it’s this problem</w:t>
+        <w:t xml:space="preserve">5.1 How you know it’s this problem</w:t>
+      </w:r>
+    </w:p>
+    <w:p>
+      <w:pPr>
+        <w:pStyle w:val="FirstParagraph"/>
+      </w:pPr>
+      <w:r>
+        <w:t xml:space="preserve">Go to the AWS console and check:</w:t>
       </w:r>
     </w:p>
     <w:p>
@@ -1731,7 +1700,7 @@
         <w:t xml:space="preserve"> </w:t>
       </w:r>
       <w:r>
-        <w:t xml:space="preserve">→ both tunnels show status</w:t>
+        <w:t xml:space="preserve">— look for the status. If it says</w:t>
       </w:r>
       <w:r>
         <w:t xml:space="preserve"> </w:t>
@@ -1744,7 +1713,7 @@
         <w:t xml:space="preserve">DOWN</w:t>
       </w:r>
       <w:r>
-        <w:t xml:space="preserve">.</w:t>
+        <w:t xml:space="preserve">, that’s the problem right there.</w:t>
       </w:r>
     </w:p>
     <w:p>
@@ -1760,70 +1729,38 @@
           <w:b/>
           <w:bCs/>
         </w:rPr>
-        <w:t xml:space="preserve">CloudWatch metric</w:t>
-      </w:r>
-      <w:r>
-        <w:rPr>
-          <w:b/>
-          <w:bCs/>
-        </w:rPr>
+        <w:t xml:space="preserve">AWS CLI</w:t>
+      </w:r>
+      <w:r>
+        <w:t xml:space="preserve"> </w:t>
+      </w:r>
+      <w:r>
+        <w:t xml:space="preserve">— run</w:t>
+      </w:r>
+      <w:r>
         <w:t xml:space="preserve"> </w:t>
       </w:r>
       <w:r>
         <w:rPr>
           <w:rStyle w:val="VerbatimChar"/>
-          <w:b/>
-          <w:bCs/>
-        </w:rPr>
-        <w:t xml:space="preserve">TunnelState</w:t>
-      </w:r>
-      <w:r>
-        <w:rPr>
-          <w:b/>
-          <w:bCs/>
-        </w:rPr>
-        <w:t xml:space="preserve"> </w:t>
-      </w:r>
-      <w:r>
-        <w:rPr>
-          <w:b/>
-          <w:bCs/>
-        </w:rPr>
-        <w:t xml:space="preserve">= 0</w:t>
-      </w:r>
-      <w:r>
-        <w:t xml:space="preserve"> </w:t>
-      </w:r>
-      <w:r>
-        <w:t xml:space="preserve">for the connection — confirms.</w:t>
-      </w:r>
-    </w:p>
-    <w:p>
-      <w:pPr>
-        <w:pStyle w:val="Compact"/>
-        <w:numPr>
-          <w:ilvl w:val="0"/>
-          <w:numId w:val="1007"/>
-        </w:numPr>
-      </w:pPr>
-      <w:r>
-        <w:rPr>
-          <w:rStyle w:val="VerbatimChar"/>
-        </w:rPr>
-        <w:t xml:space="preserve">aws ec2 describe-vpn-connections --vpn-connection-id vpn-xxx</w:t>
-      </w:r>
-      <w:r>
-        <w:t xml:space="preserve"> </w:t>
-      </w:r>
-      <w:r>
-        <w:t xml:space="preserve">— last status message says e.g. </w:t>
+        </w:rPr>
+        <w:t xml:space="preserve">aws ec2 describe-vpn-connections</w:t>
+      </w:r>
+      <w:r>
+        <w:t xml:space="preserve"> </w:t>
+      </w:r>
+      <w:r>
+        <w:t xml:space="preserve">and look for status messages like</w:t>
+      </w:r>
+      <w:r>
+        <w:t xml:space="preserve"> </w:t>
       </w:r>
       <w:r>
         <w:rPr>
           <w:i/>
           <w:iCs/>
         </w:rPr>
-        <w:t xml:space="preserve">“No proposal chosen”</w:t>
+        <w:t xml:space="preserve">“IKE failed”</w:t>
       </w:r>
       <w:r>
         <w:t xml:space="preserve"> </w:t>
@@ -1839,7 +1776,7 @@
           <w:i/>
           <w:iCs/>
         </w:rPr>
-        <w:t xml:space="preserve">“Phase 2 IPsec SA is not established”</w:t>
+        <w:t xml:space="preserve">“Phase 2 negotiation failed”</w:t>
       </w:r>
       <w:r>
         <w:t xml:space="preserve">.</w:t>
@@ -1854,7 +1791,63 @@
         </w:numPr>
       </w:pPr>
       <w:r>
-        <w:t xml:space="preserve">From the on-prem router:</w:t>
+        <w:rPr>
+          <w:b/>
+          <w:bCs/>
+        </w:rPr>
+        <w:t xml:space="preserve">VPC Reachability Analyzer</w:t>
+      </w:r>
+      <w:r>
+        <w:t xml:space="preserve"> </w:t>
+      </w:r>
+      <w:r>
+        <w:t xml:space="preserve">(AWS tool) — try to send traffic from the cloud app to the on-prem database. If it says</w:t>
+      </w:r>
+      <w:r>
+        <w:t xml:space="preserve"> </w:t>
+      </w:r>
+      <w:r>
+        <w:t xml:space="preserve">“Not reachable”</w:t>
+      </w:r>
+      <w:r>
+        <w:t xml:space="preserve"> </w:t>
+      </w:r>
+      <w:r>
+        <w:t xml:space="preserve">and mentions</w:t>
+      </w:r>
+      <w:r>
+        <w:t xml:space="preserve"> </w:t>
+      </w:r>
+      <w:r>
+        <w:t xml:space="preserve">“no active VPN tunnel,”</w:t>
+      </w:r>
+      <w:r>
+        <w:t xml:space="preserve"> </w:t>
+      </w:r>
+      <w:r>
+        <w:t xml:space="preserve">that confirms it.</w:t>
+      </w:r>
+    </w:p>
+    <w:p>
+      <w:pPr>
+        <w:pStyle w:val="Compact"/>
+        <w:numPr>
+          <w:ilvl w:val="0"/>
+          <w:numId w:val="1007"/>
+        </w:numPr>
+      </w:pPr>
+      <w:r>
+        <w:rPr>
+          <w:b/>
+          <w:bCs/>
+        </w:rPr>
+        <w:t xml:space="preserve">On-prem firewall/router</w:t>
+      </w:r>
+      <w:r>
+        <w:t xml:space="preserve"> </w:t>
+      </w:r>
+      <w:r>
+        <w:t xml:space="preserve">— log in and look for any error messages about the VPN connection. Different equipment has different commands, but usually something like</w:t>
       </w:r>
       <w:r>
         <w:t xml:space="preserve"> </w:t>
@@ -1863,13 +1856,13 @@
         <w:rPr>
           <w:rStyle w:val="VerbatimChar"/>
         </w:rPr>
-        <w:t xml:space="preserve">show crypto isakmp sa</w:t>
-      </w:r>
-      <w:r>
-        <w:t xml:space="preserve"> </w:t>
-      </w:r>
-      <w:r>
-        <w:t xml:space="preserve">(Cisco) or equivalent — the SA is in</w:t>
+        <w:t xml:space="preserve">show crypto</w:t>
+      </w:r>
+      <w:r>
+        <w:t xml:space="preserve"> </w:t>
+      </w:r>
+      <w:r>
+        <w:t xml:space="preserve">or</w:t>
       </w:r>
       <w:r>
         <w:t xml:space="preserve"> </w:t>
@@ -1878,58 +1871,20 @@
         <w:rPr>
           <w:rStyle w:val="VerbatimChar"/>
         </w:rPr>
-        <w:t xml:space="preserve">MM_NO_STATE</w:t>
-      </w:r>
-      <w:r>
-        <w:t xml:space="preserve"> </w:t>
-      </w:r>
-      <w:r>
-        <w:t xml:space="preserve">or absent.</w:t>
-      </w:r>
-    </w:p>
-    <w:p>
-      <w:pPr>
-        <w:pStyle w:val="Compact"/>
-        <w:numPr>
-          <w:ilvl w:val="0"/>
-          <w:numId w:val="1007"/>
-        </w:numPr>
-      </w:pPr>
-      <w:r>
-        <w:rPr>
-          <w:b/>
-          <w:bCs/>
-        </w:rPr>
-        <w:t xml:space="preserve">VPC Reachability Analyzer</w:t>
-      </w:r>
-      <w:r>
-        <w:t xml:space="preserve"> </w:t>
-      </w:r>
-      <w:r>
-        <w:t xml:space="preserve">with source = Lambda ENI, destination = on-prem DB port → reports</w:t>
-      </w:r>
-      <w:r>
-        <w:t xml:space="preserve"> </w:t>
-      </w:r>
-      <w:r>
-        <w:rPr>
-          <w:i/>
-          <w:iCs/>
-        </w:rPr>
-        <w:t xml:space="preserve">“Not reachable: VGW route exists, but no active VPN tunnel”</w:t>
+        <w:t xml:space="preserve">show vpn status</w:t>
       </w:r>
       <w:r>
         <w:t xml:space="preserve">.</w:t>
       </w:r>
     </w:p>
     <w:bookmarkEnd w:id="20"/>
-    <w:bookmarkStart w:id="21" w:name="fix-steps"/>
+    <w:bookmarkStart w:id="21" w:name="how-to-fix-it"/>
     <w:p>
       <w:pPr>
         <w:pStyle w:val="Heading3"/>
       </w:pPr>
       <w:r>
-        <w:t xml:space="preserve">5.2 Fix steps</w:t>
+        <w:t xml:space="preserve">5.2 How to fix it</w:t>
       </w:r>
     </w:p>
     <w:p>
@@ -1937,12 +1892,11 @@
         <w:pStyle w:val="FirstParagraph"/>
       </w:pPr>
       <w:r>
-        <w:t xml:space="preserve">The fix is to align the IPsec configuration on both sides until the tunnels come up.</w:t>
-      </w:r>
-    </w:p>
-    <w:p>
-      <w:pPr>
-        <w:pStyle w:val="Compact"/>
+        <w:t xml:space="preserve">The VPN tunnel is like a phone call between AWS and your office. Both sides need to agree on how to encrypt the call and use the same secret key. Here’s how to fix it:</w:t>
+      </w:r>
+    </w:p>
+    <w:p>
+      <w:pPr>
         <w:numPr>
           <w:ilvl w:val="0"/>
           <w:numId w:val="1008"/>
@@ -1953,30 +1907,17 @@
           <w:b/>
           <w:bCs/>
         </w:rPr>
-        <w:t xml:space="preserve">Pull the AWS-side config</w:t>
-      </w:r>
-      <w:r>
-        <w:t xml:space="preserve"> </w:t>
-      </w:r>
-      <w:r>
-        <w:t xml:space="preserve">for the VPN connection (AWS console →</w:t>
-      </w:r>
-      <w:r>
-        <w:t xml:space="preserve"> </w:t>
-      </w:r>
-      <w:r>
-        <w:t xml:space="preserve">“Download Configuration”</w:t>
-      </w:r>
-      <w:r>
-        <w:t xml:space="preserve"> </w:t>
-      </w:r>
-      <w:r>
-        <w:t xml:space="preserve">gives a vendor-specific config file).</w:t>
-      </w:r>
-    </w:p>
-    <w:p>
-      <w:pPr>
-        <w:pStyle w:val="Compact"/>
+        <w:t xml:space="preserve">Get the AWS config file</w:t>
+      </w:r>
+      <w:r>
+        <w:t xml:space="preserve"> </w:t>
+      </w:r>
+      <w:r>
+        <w:t xml:space="preserve">— go to AWS console, find your VPN connection, and download the configuration. This shows you what AWS expects.</w:t>
+      </w:r>
+    </w:p>
+    <w:p>
+      <w:pPr>
         <w:numPr>
           <w:ilvl w:val="0"/>
           <w:numId w:val="1008"/>
@@ -1987,13 +1928,13 @@
           <w:b/>
           <w:bCs/>
         </w:rPr>
-        <w:t xml:space="preserve">Compare line-by-line</w:t>
-      </w:r>
-      <w:r>
-        <w:t xml:space="preserve"> </w:t>
-      </w:r>
-      <w:r>
-        <w:t xml:space="preserve">with the on-prem router/firewall configuration. Common mismatches:</w:t>
+        <w:t xml:space="preserve">Compare with your office config</w:t>
+      </w:r>
+      <w:r>
+        <w:t xml:space="preserve"> </w:t>
+      </w:r>
+      <w:r>
+        <w:t xml:space="preserve">— have someone log in to the on-prem firewall/router and check the VPN settings. Look for these things (they must match exactly on both sides):</w:t>
       </w:r>
     </w:p>
     <w:p>
@@ -2009,13 +1950,13 @@
           <w:b/>
           <w:bCs/>
         </w:rPr>
-        <w:t xml:space="preserve">Pre-shared key</w:t>
-      </w:r>
-      <w:r>
-        <w:t xml:space="preserve"> </w:t>
-      </w:r>
-      <w:r>
-        <w:t xml:space="preserve">— typo or copy-paste error.</w:t>
+        <w:t xml:space="preserve">Secret key</w:t>
+      </w:r>
+      <w:r>
+        <w:t xml:space="preserve"> </w:t>
+      </w:r>
+      <w:r>
+        <w:t xml:space="preserve">— did someone make a typo when copying it?</w:t>
       </w:r>
     </w:p>
     <w:p>
@@ -2031,13 +1972,13 @@
           <w:b/>
           <w:bCs/>
         </w:rPr>
-        <w:t xml:space="preserve">IKE phase 1 proposal</w:t>
-      </w:r>
-      <w:r>
-        <w:t xml:space="preserve"> </w:t>
-      </w:r>
-      <w:r>
-        <w:t xml:space="preserve">— encryption (AES-256), DH group (14/19), lifetime — all must match.</w:t>
+        <w:t xml:space="preserve">Encryption method</w:t>
+      </w:r>
+      <w:r>
+        <w:t xml:space="preserve"> </w:t>
+      </w:r>
+      <w:r>
+        <w:t xml:space="preserve">— both sides should use AES-256 or whatever was agreed.</w:t>
       </w:r>
     </w:p>
     <w:p>
@@ -2053,57 +1994,228 @@
           <w:b/>
           <w:bCs/>
         </w:rPr>
-        <w:t xml:space="preserve">IPsec phase 2 proposal</w:t>
-      </w:r>
-      <w:r>
-        <w:t xml:space="preserve"> </w:t>
-      </w:r>
-      <w:r>
-        <w:t xml:space="preserve">— same idea.</w:t>
+        <w:t xml:space="preserve">Network ranges</w:t>
+      </w:r>
+      <w:r>
+        <w:t xml:space="preserve"> </w:t>
+      </w:r>
+      <w:r>
+        <w:t xml:space="preserve">— cloud side says</w:t>
+      </w:r>
+      <w:r>
+        <w:t xml:space="preserve"> </w:t>
+      </w:r>
+      <w:r>
+        <w:t xml:space="preserve">“office network is 10.0.0.0/16”</w:t>
+      </w:r>
+      <w:r>
+        <w:t xml:space="preserve">, office side says</w:t>
+      </w:r>
+      <w:r>
+        <w:t xml:space="preserve"> </w:t>
+      </w:r>
+      <w:r>
+        <w:t xml:space="preserve">“AWS network is 10.1.0.0/16”</w:t>
+      </w:r>
+      <w:r>
+        <w:t xml:space="preserve">. They should match.</w:t>
+      </w:r>
+    </w:p>
+    <w:p>
+      <w:pPr>
+        <w:numPr>
+          <w:ilvl w:val="0"/>
+          <w:numId w:val="1008"/>
+        </w:numPr>
+      </w:pPr>
+      <w:r>
+        <w:rPr>
+          <w:b/>
+          <w:bCs/>
+        </w:rPr>
+        <w:t xml:space="preserve">Fix whichever side is wrong</w:t>
+      </w:r>
+      <w:r>
+        <w:t xml:space="preserve"> </w:t>
+      </w:r>
+      <w:r>
+        <w:t xml:space="preserve">— update the config on that side. On the office equipment, you might need to clear the old tunnel and let it re-establish (different equipment has different commands, like</w:t>
+      </w:r>
+      <w:r>
+        <w:t xml:space="preserve"> </w:t>
+      </w:r>
+      <w:r>
+        <w:rPr>
+          <w:rStyle w:val="VerbatimChar"/>
+        </w:rPr>
+        <w:t xml:space="preserve">clear crypto</w:t>
+      </w:r>
+      <w:r>
+        <w:t xml:space="preserve"> </w:t>
+      </w:r>
+      <w:r>
+        <w:t xml:space="preserve">on Cisco).</w:t>
+      </w:r>
+    </w:p>
+    <w:p>
+      <w:pPr>
+        <w:numPr>
+          <w:ilvl w:val="0"/>
+          <w:numId w:val="1008"/>
+        </w:numPr>
+      </w:pPr>
+      <w:r>
+        <w:rPr>
+          <w:b/>
+          <w:bCs/>
+        </w:rPr>
+        <w:t xml:space="preserve">Check the AWS console</w:t>
+      </w:r>
+      <w:r>
+        <w:t xml:space="preserve"> </w:t>
+      </w:r>
+      <w:r>
+        <w:t xml:space="preserve">— watch the tunnel status. It should change from DOWN to UP within 1-2 minutes.</w:t>
+      </w:r>
+    </w:p>
+    <w:p>
+      <w:pPr>
+        <w:numPr>
+          <w:ilvl w:val="0"/>
+          <w:numId w:val="1008"/>
+        </w:numPr>
+      </w:pPr>
+      <w:r>
+        <w:rPr>
+          <w:b/>
+          <w:bCs/>
+        </w:rPr>
+        <w:t xml:space="preserve">Test from the cloud</w:t>
+      </w:r>
+      <w:r>
+        <w:t xml:space="preserve"> </w:t>
+      </w:r>
+      <w:r>
+        <w:t xml:space="preserve">— try</w:t>
+      </w:r>
+      <w:r>
+        <w:t xml:space="preserve"> </w:t>
+      </w:r>
+      <w:r>
+        <w:rPr>
+          <w:rStyle w:val="VerbatimChar"/>
+        </w:rPr>
+        <w:t xml:space="preserve">telnet on-prem-db-ip 5432</w:t>
+      </w:r>
+      <w:r>
+        <w:t xml:space="preserve"> </w:t>
+      </w:r>
+      <w:r>
+        <w:t xml:space="preserve">from the cloud to see if you can connect to the database now.</w:t>
+      </w:r>
+    </w:p>
+    <w:p>
+      <w:pPr>
+        <w:numPr>
+          <w:ilvl w:val="0"/>
+          <w:numId w:val="1008"/>
+        </w:numPr>
+      </w:pPr>
+      <w:r>
+        <w:rPr>
+          <w:b/>
+          <w:bCs/>
+        </w:rPr>
+        <w:t xml:space="preserve">Test from the app</w:t>
+      </w:r>
+      <w:r>
+        <w:t xml:space="preserve"> </w:t>
+      </w:r>
+      <w:r>
+        <w:t xml:space="preserve">— actually run the application and see if it can read from the database now. If it still fails, the network is working but something else is wrong (credentials, database permissions, etc.).</w:t>
+      </w:r>
+    </w:p>
+    <w:p>
+      <w:pPr>
+        <w:numPr>
+          <w:ilvl w:val="0"/>
+          <w:numId w:val="1008"/>
+        </w:numPr>
+      </w:pPr>
+      <w:r>
+        <w:rPr>
+          <w:b/>
+          <w:bCs/>
+        </w:rPr>
+        <w:t xml:space="preserve">Prevent next time</w:t>
+      </w:r>
+      <w:r>
+        <w:t xml:space="preserve"> </w:t>
+      </w:r>
+      <w:r>
+        <w:t xml:space="preserve">— set up an alert in CloudWatch so that if the VPN tunnel goes down again, someone gets notified immediately instead of finding out when the app breaks.</w:t>
+      </w:r>
+    </w:p>
+    <w:bookmarkEnd w:id="21"/>
+    <w:bookmarkStart w:id="22" w:name="why-the-tunnel-failed-likely-reasons"/>
+    <w:p>
+      <w:pPr>
+        <w:pStyle w:val="Heading3"/>
+      </w:pPr>
+      <w:r>
+        <w:t xml:space="preserve">5.3 Why the tunnel failed (likely reasons)</w:t>
+      </w:r>
+    </w:p>
+    <w:p>
+      <w:pPr>
+        <w:pStyle w:val="FirstParagraph"/>
+      </w:pPr>
+      <w:r>
+        <w:t xml:space="preserve">Usually a tunnel works fine for months, then suddenly breaks. Why?</w:t>
       </w:r>
     </w:p>
     <w:p>
       <w:pPr>
         <w:pStyle w:val="Compact"/>
         <w:numPr>
-          <w:ilvl w:val="1"/>
-          <w:numId w:val="1009"/>
-        </w:numPr>
-      </w:pPr>
-      <w:r>
-        <w:rPr>
-          <w:b/>
-          <w:bCs/>
-        </w:rPr>
-        <w:t xml:space="preserve">Local / remote networks</w:t>
-      </w:r>
-      <w:r>
-        <w:t xml:space="preserve"> </w:t>
-      </w:r>
-      <w:r>
-        <w:t xml:space="preserve">— AWS expects to see exactly the VPC CIDR as the remote network from on-prem’s perspective, and the on-prem CIDR as the remote from AWS’s.</w:t>
+          <w:ilvl w:val="0"/>
+          <w:numId w:val="1010"/>
+        </w:numPr>
+      </w:pPr>
+      <w:r>
+        <w:rPr>
+          <w:b/>
+          <w:bCs/>
+        </w:rPr>
+        <w:t xml:space="preserve">Someone changed the firewall settings</w:t>
+      </w:r>
+      <w:r>
+        <w:t xml:space="preserve"> </w:t>
+      </w:r>
+      <w:r>
+        <w:t xml:space="preserve">on the office side without updating AWS, or vice versa.</w:t>
       </w:r>
     </w:p>
     <w:p>
       <w:pPr>
         <w:pStyle w:val="Compact"/>
         <w:numPr>
-          <w:ilvl w:val="1"/>
-          <w:numId w:val="1009"/>
-        </w:numPr>
-      </w:pPr>
-      <w:r>
-        <w:rPr>
-          <w:b/>
-          <w:bCs/>
-        </w:rPr>
-        <w:t xml:space="preserve">Dead Peer Detection (DPD)</w:t>
-      </w:r>
-      <w:r>
-        <w:t xml:space="preserve"> </w:t>
-      </w:r>
-      <w:r>
-        <w:t xml:space="preserve">parameters.</w:t>
+          <w:ilvl w:val="0"/>
+          <w:numId w:val="1010"/>
+        </w:numPr>
+      </w:pPr>
+      <w:r>
+        <w:rPr>
+          <w:b/>
+          <w:bCs/>
+        </w:rPr>
+        <w:t xml:space="preserve">The secret key got corrupted</w:t>
+      </w:r>
+      <w:r>
+        <w:t xml:space="preserve"> </w:t>
+      </w:r>
+      <w:r>
+        <w:t xml:space="preserve">during a backup or update.</w:t>
       </w:r>
     </w:p>
     <w:p>
@@ -2111,30 +2223,21 @@
         <w:pStyle w:val="Compact"/>
         <w:numPr>
           <w:ilvl w:val="0"/>
-          <w:numId w:val="1008"/>
-        </w:numPr>
-      </w:pPr>
-      <w:r>
-        <w:rPr>
-          <w:b/>
-          <w:bCs/>
-        </w:rPr>
-        <w:t xml:space="preserve">Update whichever side is wrong</w:t>
-      </w:r>
-      <w:r>
-        <w:t xml:space="preserve">, then on the on-prem device clear the existing IPsec SAs and let the tunnel re-establish (</w:t>
-      </w:r>
-      <w:r>
-        <w:rPr>
-          <w:rStyle w:val="VerbatimChar"/>
-        </w:rPr>
-        <w:t xml:space="preserve">clear crypto isakmp</w:t>
-      </w:r>
-      <w:r>
-        <w:t xml:space="preserve"> </w:t>
-      </w:r>
-      <w:r>
-        <w:t xml:space="preserve">on Cisco IOS, equivalent elsewhere).</w:t>
+          <w:numId w:val="1010"/>
+        </w:numPr>
+      </w:pPr>
+      <w:r>
+        <w:rPr>
+          <w:b/>
+          <w:bCs/>
+        </w:rPr>
+        <w:t xml:space="preserve">AWS updated their VPN endpoint</w:t>
+      </w:r>
+      <w:r>
+        <w:t xml:space="preserve"> </w:t>
+      </w:r>
+      <w:r>
+        <w:t xml:space="preserve">and the on-prem side wasn’t notified.</w:t>
       </w:r>
     </w:p>
     <w:p>
@@ -2142,156 +2245,21 @@
         <w:pStyle w:val="Compact"/>
         <w:numPr>
           <w:ilvl w:val="0"/>
-          <w:numId w:val="1008"/>
-        </w:numPr>
-      </w:pPr>
-      <w:r>
-        <w:rPr>
-          <w:b/>
-          <w:bCs/>
-        </w:rPr>
-        <w:t xml:space="preserve">Watch AWS console</w:t>
-      </w:r>
-      <w:r>
-        <w:t xml:space="preserve"> </w:t>
-      </w:r>
-      <w:r>
-        <w:t xml:space="preserve">— tunnel state should transition from DOWN → UP within 30–90 seconds.</w:t>
-      </w:r>
-    </w:p>
-    <w:p>
-      <w:pPr>
-        <w:pStyle w:val="Compact"/>
-        <w:numPr>
-          <w:ilvl w:val="0"/>
-          <w:numId w:val="1008"/>
-        </w:numPr>
-      </w:pPr>
-      <w:r>
-        <w:rPr>
-          <w:b/>
-          <w:bCs/>
-        </w:rPr>
-        <w:t xml:space="preserve">Verify with Reachability Analyzer</w:t>
-      </w:r>
-      <w:r>
-        <w:t xml:space="preserve">: source = Lambda ENI, destination = on-prem DB IP/port → expect</w:t>
-      </w:r>
-      <w:r>
-        <w:t xml:space="preserve"> </w:t>
-      </w:r>
-      <w:r>
-        <w:rPr>
-          <w:i/>
-          <w:iCs/>
-        </w:rPr>
-        <w:t xml:space="preserve">“Reachable”</w:t>
-      </w:r>
-      <w:r>
-        <w:t xml:space="preserve">.</w:t>
-      </w:r>
-    </w:p>
-    <w:p>
-      <w:pPr>
-        <w:pStyle w:val="Compact"/>
-        <w:numPr>
-          <w:ilvl w:val="0"/>
-          <w:numId w:val="1008"/>
-        </w:numPr>
-      </w:pPr>
-      <w:r>
-        <w:rPr>
-          <w:b/>
-          <w:bCs/>
-        </w:rPr>
-        <w:t xml:space="preserve">Verify from the cloud app</w:t>
-      </w:r>
-      <w:r>
-        <w:t xml:space="preserve">:</w:t>
-      </w:r>
-      <w:r>
-        <w:t xml:space="preserve"> </w:t>
-      </w:r>
-      <w:r>
-        <w:rPr>
-          <w:rStyle w:val="VerbatimChar"/>
-        </w:rPr>
-        <w:t xml:space="preserve">telnet on-prem-db-ip 5432</w:t>
-      </w:r>
-      <w:r>
-        <w:t xml:space="preserve"> </w:t>
-      </w:r>
-      <w:r>
-        <w:t xml:space="preserve">from a cloud test EC2 / Lambda — TCP handshake succeeds.</w:t>
-      </w:r>
-    </w:p>
-    <w:p>
-      <w:pPr>
-        <w:pStyle w:val="Compact"/>
-        <w:numPr>
-          <w:ilvl w:val="0"/>
-          <w:numId w:val="1008"/>
-        </w:numPr>
-      </w:pPr>
-      <w:r>
-        <w:rPr>
-          <w:b/>
-          <w:bCs/>
-        </w:rPr>
-        <w:t xml:space="preserve">Try the actual DB connection</w:t>
-      </w:r>
-      <w:r>
-        <w:t xml:space="preserve"> </w:t>
-      </w:r>
-      <w:r>
-        <w:t xml:space="preserve">from the application — if the network now passes but auth fails, jump to the L7 checks (problem #10 above).</w:t>
-      </w:r>
-    </w:p>
-    <w:p>
-      <w:pPr>
-        <w:pStyle w:val="Compact"/>
-        <w:numPr>
-          <w:ilvl w:val="0"/>
-          <w:numId w:val="1008"/>
-        </w:numPr>
-      </w:pPr>
-      <w:r>
-        <w:rPr>
-          <w:b/>
-          <w:bCs/>
-        </w:rPr>
-        <w:t xml:space="preserve">Add a CloudWatch alarm</w:t>
-      </w:r>
-      <w:r>
-        <w:t xml:space="preserve"> </w:t>
-      </w:r>
-      <w:r>
-        <w:t xml:space="preserve">on</w:t>
-      </w:r>
-      <w:r>
-        <w:t xml:space="preserve"> </w:t>
-      </w:r>
-      <w:r>
-        <w:rPr>
-          <w:rStyle w:val="VerbatimChar"/>
-        </w:rPr>
-        <w:t xml:space="preserve">TunnelState = 0</w:t>
-      </w:r>
-      <w:r>
-        <w:t xml:space="preserve"> </w:t>
-      </w:r>
-      <w:r>
-        <w:t xml:space="preserve">→ SNS → on-call channel, so next time we know within minutes instead of after a deploy fails.</w:t>
-      </w:r>
-    </w:p>
-    <w:bookmarkEnd w:id="21"/>
-    <w:bookmarkStart w:id="22" w:name="X2f66c60eba451234796e4007b6e85a2c68b80e7"/>
-    <w:p>
-      <w:pPr>
-        <w:pStyle w:val="Heading3"/>
-      </w:pPr>
-      <w:r>
-        <w:t xml:space="preserve">5.3 Why it failed in the first place (likely root cause)</w:t>
+          <w:numId w:val="1010"/>
+        </w:numPr>
+      </w:pPr>
+      <w:r>
+        <w:rPr>
+          <w:b/>
+          <w:bCs/>
+        </w:rPr>
+        <w:t xml:space="preserve">There was a typo</w:t>
+      </w:r>
+      <w:r>
+        <w:t xml:space="preserve"> </w:t>
+      </w:r>
+      <w:r>
+        <w:t xml:space="preserve">when setting up the config in the first place, and it only now got noticed.</w:t>
       </w:r>
     </w:p>
     <w:p>
@@ -2299,7 +2267,7 @@
         <w:pStyle w:val="FirstParagraph"/>
       </w:pPr>
       <w:r>
-        <w:t xml:space="preserve">The most common reason a tunnel was up and then is suddenly down: someone on the on-prem side changed the firewall config (e.g., added a new IPsec policy, changed the lifetime), or AWS rotated the tunnel endpoint and the on-prem side wasn’t updated. The audit trail (CloudTrail on the AWS side, change log on the on-prem side) usually points at the change.</w:t>
+        <w:t xml:space="preserve">To find out which, check the change logs: AWS CloudTrail shows what changed on the AWS side, and your office IT should have a change log showing what changed on the office side.</w:t>
       </w:r>
     </w:p>
     <w:p>
@@ -2325,46 +2293,93 @@
         <w:pStyle w:val="FirstParagraph"/>
       </w:pPr>
       <w:r>
-        <w:t xml:space="preserve">A</w:t>
-      </w:r>
-      <w:r>
-        <w:t xml:space="preserve"> </w:t>
-      </w:r>
-      <w:r>
-        <w:t xml:space="preserve">“cloud apps cannot reach the on-prem DB”</w:t>
-      </w:r>
-      <w:r>
-        <w:t xml:space="preserve"> </w:t>
-      </w:r>
-      <w:r>
-        <w:t xml:space="preserve">problem is solved by walking the packet from the cloud Lambda/EC2 through the eight hops (subnet, SG, NACL, route table, VGW, internet, on-prem FW, switch, DB) and applying OSI bottom-up reasoning at each one. Three commands —</w:t>
-      </w:r>
-      <w:r>
-        <w:t xml:space="preserve"> </w:t>
-      </w:r>
-      <w:r>
-        <w:rPr>
-          <w:rStyle w:val="VerbatimChar"/>
-        </w:rPr>
-        <w:t xml:space="preserve">aws ec2 describe-vpn-connections</w:t>
-      </w:r>
-      <w:r>
-        <w:t xml:space="preserve">, VPC Reachability Analyzer, and</w:t>
-      </w:r>
-      <w:r>
-        <w:t xml:space="preserve"> </w:t>
-      </w:r>
-      <w:r>
-        <w:rPr>
-          <w:rStyle w:val="VerbatimChar"/>
-        </w:rPr>
-        <w:t xml:space="preserve">telnet</w:t>
-      </w:r>
-      <w:r>
-        <w:t xml:space="preserve"> </w:t>
-      </w:r>
-      <w:r>
-        <w:t xml:space="preserve">from a cloud instance to the DB port — pin down the failing layer in minutes. The most common cause is a VPN tunnel that is down because of a mismatched IPsec configuration; the fix is to align both sides’ pre-shared key, IKE/IPsec proposals, and local/remote networks, then add a CloudWatch alarm so the next failure surfaces before a deploy does.</w:t>
+        <w:t xml:space="preserve">When the cloud app can’t reach the on-prem database, you troubleshoot it in two steps:</w:t>
+      </w:r>
+    </w:p>
+    <w:p>
+      <w:pPr>
+        <w:pStyle w:val="BodyText"/>
+      </w:pPr>
+      <w:r>
+        <w:rPr>
+          <w:b/>
+          <w:bCs/>
+        </w:rPr>
+        <w:t xml:space="preserve">Step 1: Walk the packet</w:t>
+      </w:r>
+      <w:r>
+        <w:t xml:space="preserve"> </w:t>
+      </w:r>
+      <w:r>
+        <w:t xml:space="preserve">— trace the data from the cloud app all the way to the database server, checking at each stop (</w:t>
+      </w:r>
+      <w:r>
+        <w:t xml:space="preserve">“is the firewall allowing this? is the router configured right? is the database listening?”</w:t>
+      </w:r>
+      <w:r>
+        <w:t xml:space="preserve">).</w:t>
+      </w:r>
+    </w:p>
+    <w:p>
+      <w:pPr>
+        <w:pStyle w:val="BodyText"/>
+      </w:pPr>
+      <w:r>
+        <w:rPr>
+          <w:b/>
+          <w:bCs/>
+        </w:rPr>
+        <w:t xml:space="preserve">Step 2: Check from the bottom up</w:t>
+      </w:r>
+      <w:r>
+        <w:t xml:space="preserve"> </w:t>
+      </w:r>
+      <w:r>
+        <w:t xml:space="preserve">— start with the physical cables, then check the network routing, then the firewalls, then the application. If the cables are broken, there’s no point checking the database settings.</w:t>
+      </w:r>
+    </w:p>
+    <w:p>
+      <w:pPr>
+        <w:pStyle w:val="BodyText"/>
+      </w:pPr>
+      <w:r>
+        <w:rPr>
+          <w:b/>
+          <w:bCs/>
+        </w:rPr>
+        <w:t xml:space="preserve">Three quick checks</w:t>
+      </w:r>
+      <w:r>
+        <w:t xml:space="preserve"> </w:t>
+      </w:r>
+      <w:r>
+        <w:t xml:space="preserve">that usually pinpoint the problem: (1) Is the VPN tunnel UP? (2) Does AWS Reachability Analyzer say the database is reachable? (3) Can you connect to the database port with telnet?</w:t>
+      </w:r>
+    </w:p>
+    <w:p>
+      <w:pPr>
+        <w:pStyle w:val="BodyText"/>
+      </w:pPr>
+      <w:r>
+        <w:rPr>
+          <w:b/>
+          <w:bCs/>
+        </w:rPr>
+        <w:t xml:space="preserve">The most common problem</w:t>
+      </w:r>
+      <w:r>
+        <w:t xml:space="preserve"> </w:t>
+      </w:r>
+      <w:r>
+        <w:t xml:space="preserve">is a VPN tunnel that’s DOWN because the cloud and office configurations don’t match. The fix: compare the two sides’ settings, find what’s different, update it, and restart the tunnel.</w:t>
+      </w:r>
+    </w:p>
+    <w:p>
+      <w:pPr>
+        <w:pStyle w:val="BodyText"/>
+      </w:pPr>
+      <w:r>
+        <w:t xml:space="preserve">This approach is learned from the course’s troubleshooting method, and it works well for any cloud-to-on-prem connectivity problem.</w:t>
       </w:r>
     </w:p>
     <w:p>
@@ -2389,7 +2404,7 @@
         <w:pStyle w:val="Compact"/>
         <w:numPr>
           <w:ilvl w:val="0"/>
-          <w:numId w:val="1010"/>
+          <w:numId w:val="1011"/>
         </w:numPr>
       </w:pPr>
       <w:r>
@@ -2414,7 +2429,7 @@
         <w:pStyle w:val="Compact"/>
         <w:numPr>
           <w:ilvl w:val="0"/>
-          <w:numId w:val="1010"/>
+          <w:numId w:val="1011"/>
         </w:numPr>
       </w:pPr>
       <w:r>
@@ -2439,7 +2454,7 @@
         <w:pStyle w:val="Compact"/>
         <w:numPr>
           <w:ilvl w:val="0"/>
-          <w:numId w:val="1010"/>
+          <w:numId w:val="1011"/>
         </w:numPr>
       </w:pPr>
       <w:r>
@@ -2464,7 +2479,7 @@
         <w:pStyle w:val="Compact"/>
         <w:numPr>
           <w:ilvl w:val="0"/>
-          <w:numId w:val="1010"/>
+          <w:numId w:val="1011"/>
         </w:numPr>
       </w:pPr>
       <w:r>
@@ -2489,7 +2504,7 @@
         <w:pStyle w:val="Compact"/>
         <w:numPr>
           <w:ilvl w:val="0"/>
-          <w:numId w:val="1010"/>
+          <w:numId w:val="1011"/>
         </w:numPr>
       </w:pPr>
       <w:r>
@@ -2501,7 +2516,7 @@
         <w:pStyle w:val="Compact"/>
         <w:numPr>
           <w:ilvl w:val="0"/>
-          <w:numId w:val="1010"/>
+          <w:numId w:val="1011"/>
         </w:numPr>
       </w:pPr>
       <w:r>
@@ -2974,6 +2989,9 @@
     <w:abstractNumId w:val="991"/>
   </w:num>
   <w:num w:numId="1010">
+    <w:abstractNumId w:val="991"/>
+  </w:num>
+  <w:num w:numId="1011">
     <w:abstractNumId w:val="99411"/>
     <w:lvlOverride w:ilvl="0">
       <w:startOverride w:val="1"/>

</xml_diff>